<commit_message>
Add final Part 3 results: all six pre-registered tests reported
Hybrid first stage and stronger distillation confirmed on three new real-speech test
sets; real-speech training not supported. Updates results, figures, paper, report and README.

Co-Authored-By: Claude Opus 5.5 <noreply@anthropic.com>
</commit_message>
<xml_diff>
--- a/paper/Paper.docx
+++ b/paper/Paper.docx
@@ -89,7 +89,7 @@
           <w:sz w:val="22"/>
           <w:szCs w:val="22"/>
         </w:rPr>
-        <w:t xml:space="preserve">Voice agents answer callers by retrieving passages with a speech-recognition (ASR) transcript rather than with what the caller actually said, yet the rerankers in these pipelines are trained on typed text. We measure how a production two-stage pipeline (BM25 followed by a MiniLM cross-encoder reranker), together with dense and hybrid first stages, degrades on spoken queries in two settings: spoken versions of three BEIR collections from science, nutrition/medicine and finance (1,271 queries), synthesised in five English accents and transcribed by Whisper over a wideband channel and a simulated telephone line; and real human speech from SD-QA, 747 Wikipedia questions read aloud by speakers of eleven English dialects including North and South Indian English. Synthetic speech reduces nDCG@10 by 7–25% over wideband audio and 24–58% over the telephone; real speech costs 11.2% on average and 16.9% for Indian English; and the reranker does not reduce the relative loss. Fine-tuning the reranker on clean in-domain text makes it more fragile to speech, and training on transcripts with relevance labels repairs only part of this damage. Label-free consistency distillation, which trains the reranker to score a transcript the way the original model scores the clean question, avoids the damage: it is never significantly worse than the zero-shot model, is significantly better than clean fine-tuning on two of three collections, and is the best reranker on every real-speech group, although its gain over zero-shot (+0.002 to +0.004 nDCG@10) is not significant after correction. The largest improvement on real speech comes from the first stage: re-ranking a hybrid BM25 + dense candidate list instead of a BM25 list raises nDCG@10 from 0.516 to 0.607. In a pre-registered follow-up with a modern 278M-parameter reranker (bge-reranker-base), clean fine-tuning again widened the telephone loss (by 2.8 points, 95% CI 0.7–4.8), while consistency distillation significantly outperformed the zero-shot model in 7 of 9 dataset–condition cells and was never worse. An error analysis shows that misrecognised content words, not function words, drive the loss, and that in about half of the failures the relevant passage never reaches the reranker. We discuss implications for voice agents, including the choice of ASR model for Indian-English callers and a re-ranking latency of about 1.1 s on CPU.</w:t>
+        <w:t xml:space="preserve">Voice agents answer callers by retrieving passages with a speech-recognition (ASR) transcript rather than with what the caller actually said, yet the rerankers in these pipelines are trained on typed text. We measure how a production two-stage pipeline (BM25 followed by a MiniLM cross-encoder reranker), together with dense and hybrid first stages, degrades on spoken queries in two settings: spoken versions of three BEIR collections from science, nutrition/medicine and finance (1,271 queries), synthesised in five English accents and transcribed by Whisper over a wideband channel and a simulated telephone line; and real human speech from SD-QA, 747 Wikipedia questions read aloud by speakers of eleven English dialects including North and South Indian English. Synthetic speech reduces nDCG@10 by 7–25% over wideband audio and 24–58% over the telephone; real speech costs 11.2% on average and 16.9% for Indian English; and the reranker does not reduce the relative loss. Fine-tuning the reranker on clean in-domain text makes it more fragile to speech, and training on transcripts with relevance labels repairs only part of this damage. Label-free consistency distillation, which trains the reranker to score a transcript the way the original model scores the clean question, avoids the damage: it is never significantly worse than the zero-shot model, is significantly better than clean fine-tuning on two of three collections, and is the best reranker on every real-speech group, although its gain over zero-shot (+0.002 to +0.004 nDCG@10) is not significant after correction. The largest improvement on real speech comes from the first stage: re-ranking a hybrid BM25 + dense candidate list instead of a BM25 list raises nDCG@10 from 0.516 to 0.607. In a pre-registered follow-up with a modern 278M-parameter reranker (bge-reranker-base), clean fine-tuning again widened the telephone loss (by 2.8 points, 95% CI 0.7–4.8), while consistency distillation significantly outperformed the zero-shot model in 7 of 9 dataset–condition cells and was never worse. An error analysis shows that misrecognised content words, not function words, drive the loss, and that in more than half of the failures the relevant passage never reaches the reranker. Pre-registered tests on three new real-speech test sets confirm that a hybrid first stage helps (+0.010 to +0.085 nDCG@10) and that distillation from a 568M-parameter teacher significantly improves the 22.7M reranker over its zero-shot self; training on real rather than synthetic speech errors did not help. We discuss implications for voice agents, including the choice of ASR model for Indian-English callers and a re-ranking latency of about 1.1 s on CPU.</w:t>
       </w:r>
     </w:p>
     <w:p>
@@ -305,7 +305,7 @@
           <w:sz w:val="22"/>
           <w:szCs w:val="22"/>
         </w:rPr>
-        <w:t xml:space="preserve">Our contributions are: (1) spoken versions of three BEIR test collections in specialist domains, under wideband and telephone conditions with five accents; (2) a significance-tested robustness comparison of BM25, dense, hybrid and cross-encoder pipelines on these queries; (3) a controlled fine-tuning study that separates the effect of training on noisy transcripts from the effect of in-domain adaptation, using a clean-text control, three seeds and two pre-declared checkpoint-selection protocols; (4) label-free consistency distillation for cross-encoder rerankers, adapting self-teaching [6] from dense retrievers; (5) a passage-retrieval version of SD-QA [16] that evaluates rerankers on real speech in eleven English dialects; (6) a pre-registered replication of the fine-tuning findings on a modern reranker, with an error analysis of which words break; and (7) an effectiveness–latency analysis for deployment.</w:t>
+        <w:t xml:space="preserve">Our contributions are: (1) spoken versions of three BEIR test collections in specialist domains, under wideband and telephone conditions with five accents; (2) a significance-tested robustness comparison of BM25, dense, hybrid and cross-encoder pipelines on these queries; (3) a controlled fine-tuning study that separates the effect of training on noisy transcripts from the effect of in-domain adaptation, using a clean-text control, three seeds and two pre-declared checkpoint-selection protocols; (4) label-free consistency distillation for cross-encoder rerankers, adapting self-teaching [6] from dense retrievers; (5) a passage-retrieval version of SD-QA [16] that evaluates rerankers on real speech in eleven English dialects; (6) six pre-registered tests on a modern reranker and three new real-speech test sets, including an error analysis of which words break and a negative result for real-speech training; and (7) an effectiveness–latency analysis for deployment.</w:t>
       </w:r>
     </w:p>
     <w:p>
@@ -11818,7 +11818,7 @@
           <w:sz w:val="22"/>
           <w:szCs w:val="22"/>
         </w:rPr>
-        <w:t xml:space="preserve">Before running further experiments we pre-registered six hypotheses, test sets and statistical tests (committed to the repository on 21 Oct 2026, before any result). This section reports the three that are complete; the remaining three (first-stage replication on new real-speech sets, real vs. synthetic training noise from HeySQuAD [22], and a stronger distillation teacher) are running and are not reported here.</w:t>
+        <w:t xml:space="preserve">Before running further experiments we pre-registered six hypotheses, test sets and statistical tests (committed to the repository on 21 Oct 2026, before any result). All six tests were run as specified and are reported here, including the one that failed. The confirmatory test sets were new: SD-QA re-transcribed with Whisper base.en (the Part 1 recogniser; 704 questions × 11 dialects after dropping 43 questions with no Kenyan recording), HeySQuAD dev (1,002 human-spoken questions over 11,559 SQuAD paragraphs) and SLUE-SQA-5 test (2,382 real-speech questions over 3,192 documents).</w:t>
       </w:r>
     </w:p>
     <w:p>
@@ -12971,7 +12971,7 @@
           <w:sz w:val="22"/>
           <w:szCs w:val="22"/>
         </w:rPr>
-        <w:t xml:space="preserve">Among spoken queries that lose effectiveness, the relevant passage is absent from the BM25 top-25 in 53% (SD-QA, 95% CI 47–59%) and 56% (BEIR telephone, 51–61%) of cases, and 42% for wideband BEIR. In these cases the reranker never sees the right passage, which explains why first-stage improvements help more than re-ranking.</w:t>
+        <w:t xml:space="preserve">Among spoken queries that lose effectiveness, the relevant passage is absent from the BM25 top-25 in 68% (SD-QA with Whisper, 95% CI 64–72%), 53% (SD-QA with Google ASR) and 56% (BEIR telephone, 51–61%) of cases, and 42% for wideband BEIR; the pre-registered prediction (&gt; 50% on SD-QA-Whisper and BEIR telephone) holds. In these cases the reranker never sees the right passage, which explains why first-stage improvements help more than re-ranking.</w:t>
       </w:r>
     </w:p>
     <w:p>
@@ -13143,6 +13143,136 @@
                 <w:szCs w:val="18"/>
               </w:rPr>
               <w:t xml:space="preserve">Recall-failure share</w:t>
+            </w:r>
+          </w:p>
+        </w:tc>
+      </w:tr>
+      <w:tr>
+        <w:tc>
+          <w:tcPr>
+            <w:tcW w:type="dxa" w:w="2200"/>
+            <w:tcBorders>
+              <w:top w:val="single" w:color="999999" w:sz="4"/>
+              <w:left w:val="single" w:color="999999" w:sz="4"/>
+              <w:bottom w:val="single" w:color="999999" w:sz="4"/>
+              <w:right w:val="single" w:color="999999" w:sz="4"/>
+            </w:tcBorders>
+            <w:tcMar>
+              <w:top w:type="dxa" w:w="40"/>
+              <w:left w:type="dxa" w:w="80"/>
+              <w:bottom w:type="dxa" w:w="40"/>
+              <w:right w:type="dxa" w:w="80"/>
+            </w:tcMar>
+          </w:tcPr>
+          <w:p>
+            <w:pPr>
+              <w:jc w:val="left"/>
+            </w:pPr>
+            <w:r>
+              <w:rPr>
+                <w:rFonts w:ascii="Times New Roman" w:cs="Times New Roman" w:eastAsia="Times New Roman" w:hAnsi="Times New Roman"/>
+                <w:b w:val="false"/>
+                <w:bCs w:val="false"/>
+                <w:sz w:val="18"/>
+                <w:szCs w:val="18"/>
+              </w:rPr>
+              <w:t xml:space="preserve">SD-QA (Whisper base.en)</w:t>
+            </w:r>
+          </w:p>
+        </w:tc>
+        <w:tc>
+          <w:tcPr>
+            <w:tcW w:type="dxa" w:w="2400"/>
+            <w:tcBorders>
+              <w:top w:val="single" w:color="999999" w:sz="4"/>
+              <w:left w:val="single" w:color="999999" w:sz="4"/>
+              <w:bottom w:val="single" w:color="999999" w:sz="4"/>
+              <w:right w:val="single" w:color="999999" w:sz="4"/>
+            </w:tcBorders>
+            <w:tcMar>
+              <w:top w:type="dxa" w:w="40"/>
+              <w:left w:type="dxa" w:w="80"/>
+              <w:bottom w:type="dxa" w:w="40"/>
+              <w:right w:type="dxa" w:w="80"/>
+            </w:tcMar>
+          </w:tcPr>
+          <w:p>
+            <w:pPr>
+              <w:jc w:val="center"/>
+            </w:pPr>
+            <w:r>
+              <w:rPr>
+                <w:rFonts w:ascii="Times New Roman" w:cs="Times New Roman" w:eastAsia="Times New Roman" w:hAnsi="Times New Roman"/>
+                <w:b w:val="false"/>
+                <w:bCs w:val="false"/>
+                <w:sz w:val="18"/>
+                <w:szCs w:val="18"/>
+              </w:rPr>
+              <w:t xml:space="preserve">−0.639 [−0.716, −0.569]</w:t>
+            </w:r>
+          </w:p>
+        </w:tc>
+        <w:tc>
+          <w:tcPr>
+            <w:tcW w:type="dxa" w:w="2400"/>
+            <w:tcBorders>
+              <w:top w:val="single" w:color="999999" w:sz="4"/>
+              <w:left w:val="single" w:color="999999" w:sz="4"/>
+              <w:bottom w:val="single" w:color="999999" w:sz="4"/>
+              <w:right w:val="single" w:color="999999" w:sz="4"/>
+            </w:tcBorders>
+            <w:tcMar>
+              <w:top w:type="dxa" w:w="40"/>
+              <w:left w:type="dxa" w:w="80"/>
+              <w:bottom w:type="dxa" w:w="40"/>
+              <w:right w:type="dxa" w:w="80"/>
+            </w:tcMar>
+          </w:tcPr>
+          <w:p>
+            <w:pPr>
+              <w:jc w:val="center"/>
+            </w:pPr>
+            <w:r>
+              <w:rPr>
+                <w:rFonts w:ascii="Times New Roman" w:cs="Times New Roman" w:eastAsia="Times New Roman" w:hAnsi="Times New Roman"/>
+                <w:b w:val="false"/>
+                <w:bCs w:val="false"/>
+                <w:sz w:val="18"/>
+                <w:szCs w:val="18"/>
+              </w:rPr>
+              <w:t xml:space="preserve">+0.046 [−0.016, +0.111]</w:t>
+            </w:r>
+          </w:p>
+        </w:tc>
+        <w:tc>
+          <w:tcPr>
+            <w:tcW w:type="dxa" w:w="2026"/>
+            <w:tcBorders>
+              <w:top w:val="single" w:color="999999" w:sz="4"/>
+              <w:left w:val="single" w:color="999999" w:sz="4"/>
+              <w:bottom w:val="single" w:color="999999" w:sz="4"/>
+              <w:right w:val="single" w:color="999999" w:sz="4"/>
+            </w:tcBorders>
+            <w:tcMar>
+              <w:top w:type="dxa" w:w="40"/>
+              <w:left w:type="dxa" w:w="80"/>
+              <w:bottom w:type="dxa" w:w="40"/>
+              <w:right w:type="dxa" w:w="80"/>
+            </w:tcMar>
+          </w:tcPr>
+          <w:p>
+            <w:pPr>
+              <w:jc w:val="center"/>
+            </w:pPr>
+            <w:r>
+              <w:rPr>
+                <w:rFonts w:ascii="Times New Roman" w:cs="Times New Roman" w:eastAsia="Times New Roman" w:hAnsi="Times New Roman"/>
+                <w:b w:val="false"/>
+                <w:bCs w:val="false"/>
+                <w:sz w:val="18"/>
+                <w:szCs w:val="18"/>
+              </w:rPr>
+              <w:t xml:space="preserve">68% [64, 72]</w:t>
             </w:r>
           </w:p>
         </w:tc>
@@ -13603,6 +13733,3200 @@
     </w:p>
     <w:p>
       <w:pPr>
+        <w:spacing w:after="120" w:before="0" w:line="276"/>
+        <w:jc w:val="both"/>
+      </w:pPr>
+      <w:r>
+        <w:rPr>
+          <w:rFonts w:ascii="Times New Roman" w:cs="Times New Roman" w:eastAsia="Times New Roman" w:hAnsi="Times New Roman"/>
+          <w:b/>
+          <w:bCs/>
+          <w:sz w:val="22"/>
+          <w:szCs w:val="22"/>
+        </w:rPr>
+        <w:t xml:space="preserve">First stage on new real speech (C1, confirmed). </w:t>
+      </w:r>
+      <w:r>
+        <w:rPr>
+          <w:rFonts w:ascii="Times New Roman" w:cs="Times New Roman" w:eastAsia="Times New Roman" w:hAnsi="Times New Roman"/>
+          <w:sz w:val="22"/>
+          <w:szCs w:val="22"/>
+        </w:rPr>
+        <w:t xml:space="preserve">Re-ranking a hybrid candidate list beats re-ranking a BM25 list on all three new test sets (Table XII, Fig. 8), each significant after Holm correction: +0.085 nDCG@10 on SD-QA-Whisper, +0.046 on SLUE-SQA-5 and +0.010 on HeySQuAD, where BM25 alone already scores 0.85. The Part 2 exploratory finding therefore replicates on unseen data and a different recogniser.</w:t>
+      </w:r>
+    </w:p>
+    <w:p>
+      <w:pPr>
+        <w:keepNext/>
+        <w:spacing w:after="80" w:before="160"/>
+        <w:jc w:val="center"/>
+      </w:pPr>
+      <w:r>
+        <w:rPr>
+          <w:rFonts w:ascii="Times New Roman" w:cs="Times New Roman" w:eastAsia="Times New Roman" w:hAnsi="Times New Roman"/>
+          <w:b/>
+          <w:bCs/>
+          <w:sz w:val="19"/>
+          <w:szCs w:val="19"/>
+        </w:rPr>
+        <w:t xml:space="preserve">TABLE XII. C1: BM25 → ce-l6 vs. Hybrid → ce-l6 on new real-speech test sets (nDCG@10; Holm over 3 tests)</w:t>
+      </w:r>
+    </w:p>
+    <w:tbl>
+      <w:tblPr>
+        <w:tblW w:type="dxa" w:w="9026"/>
+        <w:jc w:val="center"/>
+        <w:tblBorders>
+          <w:top w:val="single" w:color="auto" w:sz="4"/>
+          <w:left w:val="single" w:color="auto" w:sz="4"/>
+          <w:bottom w:val="single" w:color="auto" w:sz="4"/>
+          <w:right w:val="single" w:color="auto" w:sz="4"/>
+          <w:insideH w:val="single" w:color="auto" w:sz="4"/>
+          <w:insideV w:val="single" w:color="auto" w:sz="4"/>
+        </w:tblBorders>
+      </w:tblPr>
+      <w:tblGrid>
+        <w:gridCol w:w="1700"/>
+        <w:gridCol w:w="900"/>
+        <w:gridCol w:w="900"/>
+        <w:gridCol w:w="900"/>
+        <w:gridCol w:w="1100"/>
+        <w:gridCol w:w="1200"/>
+        <w:gridCol w:w="1000"/>
+        <w:gridCol w:w="1326"/>
+      </w:tblGrid>
+      <w:tr>
+        <w:trPr>
+          <w:tblHeader/>
+        </w:trPr>
+        <w:tc>
+          <w:tcPr>
+            <w:tcW w:type="dxa" w:w="1700"/>
+            <w:tcBorders>
+              <w:top w:val="single" w:color="999999" w:sz="4"/>
+              <w:left w:val="single" w:color="999999" w:sz="4"/>
+              <w:bottom w:val="single" w:color="999999" w:sz="4"/>
+              <w:right w:val="single" w:color="999999" w:sz="4"/>
+            </w:tcBorders>
+            <w:shd w:fill="E8EEF4" w:color="auto" w:val="clear"/>
+            <w:tcMar>
+              <w:top w:type="dxa" w:w="40"/>
+              <w:left w:type="dxa" w:w="80"/>
+              <w:bottom w:type="dxa" w:w="40"/>
+              <w:right w:type="dxa" w:w="80"/>
+            </w:tcMar>
+          </w:tcPr>
+          <w:p>
+            <w:pPr>
+              <w:jc w:val="left"/>
+            </w:pPr>
+            <w:r>
+              <w:rPr>
+                <w:rFonts w:ascii="Times New Roman" w:cs="Times New Roman" w:eastAsia="Times New Roman" w:hAnsi="Times New Roman"/>
+                <w:b/>
+                <w:bCs/>
+                <w:sz w:val="18"/>
+                <w:szCs w:val="18"/>
+              </w:rPr>
+              <w:t xml:space="preserve">Test set</w:t>
+            </w:r>
+          </w:p>
+        </w:tc>
+        <w:tc>
+          <w:tcPr>
+            <w:tcW w:type="dxa" w:w="900"/>
+            <w:tcBorders>
+              <w:top w:val="single" w:color="999999" w:sz="4"/>
+              <w:left w:val="single" w:color="999999" w:sz="4"/>
+              <w:bottom w:val="single" w:color="999999" w:sz="4"/>
+              <w:right w:val="single" w:color="999999" w:sz="4"/>
+            </w:tcBorders>
+            <w:shd w:fill="E8EEF4" w:color="auto" w:val="clear"/>
+            <w:tcMar>
+              <w:top w:type="dxa" w:w="40"/>
+              <w:left w:type="dxa" w:w="80"/>
+              <w:bottom w:type="dxa" w:w="40"/>
+              <w:right w:type="dxa" w:w="80"/>
+            </w:tcMar>
+          </w:tcPr>
+          <w:p>
+            <w:pPr>
+              <w:jc w:val="center"/>
+            </w:pPr>
+            <w:r>
+              <w:rPr>
+                <w:rFonts w:ascii="Times New Roman" w:cs="Times New Roman" w:eastAsia="Times New Roman" w:hAnsi="Times New Roman"/>
+                <w:b/>
+                <w:bCs/>
+                <w:sz w:val="18"/>
+                <w:szCs w:val="18"/>
+              </w:rPr>
+              <w:t xml:space="preserve">Queries</w:t>
+            </w:r>
+          </w:p>
+        </w:tc>
+        <w:tc>
+          <w:tcPr>
+            <w:tcW w:type="dxa" w:w="900"/>
+            <w:tcBorders>
+              <w:top w:val="single" w:color="999999" w:sz="4"/>
+              <w:left w:val="single" w:color="999999" w:sz="4"/>
+              <w:bottom w:val="single" w:color="999999" w:sz="4"/>
+              <w:right w:val="single" w:color="999999" w:sz="4"/>
+            </w:tcBorders>
+            <w:shd w:fill="E8EEF4" w:color="auto" w:val="clear"/>
+            <w:tcMar>
+              <w:top w:type="dxa" w:w="40"/>
+              <w:left w:type="dxa" w:w="80"/>
+              <w:bottom w:type="dxa" w:w="40"/>
+              <w:right w:type="dxa" w:w="80"/>
+            </w:tcMar>
+          </w:tcPr>
+          <w:p>
+            <w:pPr>
+              <w:jc w:val="center"/>
+            </w:pPr>
+            <w:r>
+              <w:rPr>
+                <w:rFonts w:ascii="Times New Roman" w:cs="Times New Roman" w:eastAsia="Times New Roman" w:hAnsi="Times New Roman"/>
+                <w:b/>
+                <w:bCs/>
+                <w:sz w:val="18"/>
+                <w:szCs w:val="18"/>
+              </w:rPr>
+              <w:t xml:space="preserve">BM25</w:t>
+            </w:r>
+          </w:p>
+        </w:tc>
+        <w:tc>
+          <w:tcPr>
+            <w:tcW w:type="dxa" w:w="900"/>
+            <w:tcBorders>
+              <w:top w:val="single" w:color="999999" w:sz="4"/>
+              <w:left w:val="single" w:color="999999" w:sz="4"/>
+              <w:bottom w:val="single" w:color="999999" w:sz="4"/>
+              <w:right w:val="single" w:color="999999" w:sz="4"/>
+            </w:tcBorders>
+            <w:shd w:fill="E8EEF4" w:color="auto" w:val="clear"/>
+            <w:tcMar>
+              <w:top w:type="dxa" w:w="40"/>
+              <w:left w:type="dxa" w:w="80"/>
+              <w:bottom w:type="dxa" w:w="40"/>
+              <w:right w:type="dxa" w:w="80"/>
+            </w:tcMar>
+          </w:tcPr>
+          <w:p>
+            <w:pPr>
+              <w:jc w:val="center"/>
+            </w:pPr>
+            <w:r>
+              <w:rPr>
+                <w:rFonts w:ascii="Times New Roman" w:cs="Times New Roman" w:eastAsia="Times New Roman" w:hAnsi="Times New Roman"/>
+                <w:b/>
+                <w:bCs/>
+                <w:sz w:val="18"/>
+                <w:szCs w:val="18"/>
+              </w:rPr>
+              <w:t xml:space="preserve">Dense</w:t>
+            </w:r>
+          </w:p>
+        </w:tc>
+        <w:tc>
+          <w:tcPr>
+            <w:tcW w:type="dxa" w:w="1100"/>
+            <w:tcBorders>
+              <w:top w:val="single" w:color="999999" w:sz="4"/>
+              <w:left w:val="single" w:color="999999" w:sz="4"/>
+              <w:bottom w:val="single" w:color="999999" w:sz="4"/>
+              <w:right w:val="single" w:color="999999" w:sz="4"/>
+            </w:tcBorders>
+            <w:shd w:fill="E8EEF4" w:color="auto" w:val="clear"/>
+            <w:tcMar>
+              <w:top w:type="dxa" w:w="40"/>
+              <w:left w:type="dxa" w:w="80"/>
+              <w:bottom w:type="dxa" w:w="40"/>
+              <w:right w:type="dxa" w:w="80"/>
+            </w:tcMar>
+          </w:tcPr>
+          <w:p>
+            <w:pPr>
+              <w:jc w:val="center"/>
+            </w:pPr>
+            <w:r>
+              <w:rPr>
+                <w:rFonts w:ascii="Times New Roman" w:cs="Times New Roman" w:eastAsia="Times New Roman" w:hAnsi="Times New Roman"/>
+                <w:b/>
+                <w:bCs/>
+                <w:sz w:val="18"/>
+                <w:szCs w:val="18"/>
+              </w:rPr>
+              <w:t xml:space="preserve">BM25 → CE</w:t>
+            </w:r>
+          </w:p>
+        </w:tc>
+        <w:tc>
+          <w:tcPr>
+            <w:tcW w:type="dxa" w:w="1200"/>
+            <w:tcBorders>
+              <w:top w:val="single" w:color="999999" w:sz="4"/>
+              <w:left w:val="single" w:color="999999" w:sz="4"/>
+              <w:bottom w:val="single" w:color="999999" w:sz="4"/>
+              <w:right w:val="single" w:color="999999" w:sz="4"/>
+            </w:tcBorders>
+            <w:shd w:fill="E8EEF4" w:color="auto" w:val="clear"/>
+            <w:tcMar>
+              <w:top w:type="dxa" w:w="40"/>
+              <w:left w:type="dxa" w:w="80"/>
+              <w:bottom w:type="dxa" w:w="40"/>
+              <w:right w:type="dxa" w:w="80"/>
+            </w:tcMar>
+          </w:tcPr>
+          <w:p>
+            <w:pPr>
+              <w:jc w:val="center"/>
+            </w:pPr>
+            <w:r>
+              <w:rPr>
+                <w:rFonts w:ascii="Times New Roman" w:cs="Times New Roman" w:eastAsia="Times New Roman" w:hAnsi="Times New Roman"/>
+                <w:b/>
+                <w:bCs/>
+                <w:sz w:val="18"/>
+                <w:szCs w:val="18"/>
+              </w:rPr>
+              <w:t xml:space="preserve">Hybrid → CE</w:t>
+            </w:r>
+          </w:p>
+        </w:tc>
+        <w:tc>
+          <w:tcPr>
+            <w:tcW w:type="dxa" w:w="1000"/>
+            <w:tcBorders>
+              <w:top w:val="single" w:color="999999" w:sz="4"/>
+              <w:left w:val="single" w:color="999999" w:sz="4"/>
+              <w:bottom w:val="single" w:color="999999" w:sz="4"/>
+              <w:right w:val="single" w:color="999999" w:sz="4"/>
+            </w:tcBorders>
+            <w:shd w:fill="E8EEF4" w:color="auto" w:val="clear"/>
+            <w:tcMar>
+              <w:top w:type="dxa" w:w="40"/>
+              <w:left w:type="dxa" w:w="80"/>
+              <w:bottom w:type="dxa" w:w="40"/>
+              <w:right w:type="dxa" w:w="80"/>
+            </w:tcMar>
+          </w:tcPr>
+          <w:p>
+            <w:pPr>
+              <w:jc w:val="center"/>
+            </w:pPr>
+            <w:r>
+              <w:rPr>
+                <w:rFonts w:ascii="Times New Roman" w:cs="Times New Roman" w:eastAsia="Times New Roman" w:hAnsi="Times New Roman"/>
+                <w:b/>
+                <w:bCs/>
+                <w:sz w:val="18"/>
+                <w:szCs w:val="18"/>
+              </w:rPr>
+              <w:t xml:space="preserve">Δ</w:t>
+            </w:r>
+          </w:p>
+        </w:tc>
+        <w:tc>
+          <w:tcPr>
+            <w:tcW w:type="dxa" w:w="1326"/>
+            <w:tcBorders>
+              <w:top w:val="single" w:color="999999" w:sz="4"/>
+              <w:left w:val="single" w:color="999999" w:sz="4"/>
+              <w:bottom w:val="single" w:color="999999" w:sz="4"/>
+              <w:right w:val="single" w:color="999999" w:sz="4"/>
+            </w:tcBorders>
+            <w:shd w:fill="E8EEF4" w:color="auto" w:val="clear"/>
+            <w:tcMar>
+              <w:top w:type="dxa" w:w="40"/>
+              <w:left w:type="dxa" w:w="80"/>
+              <w:bottom w:type="dxa" w:w="40"/>
+              <w:right w:type="dxa" w:w="80"/>
+            </w:tcMar>
+          </w:tcPr>
+          <w:p>
+            <w:pPr>
+              <w:jc w:val="center"/>
+            </w:pPr>
+            <w:r>
+              <w:rPr>
+                <w:rFonts w:ascii="Times New Roman" w:cs="Times New Roman" w:eastAsia="Times New Roman" w:hAnsi="Times New Roman"/>
+                <w:b/>
+                <w:bCs/>
+                <w:sz w:val="18"/>
+                <w:szCs w:val="18"/>
+              </w:rPr>
+              <w:t xml:space="preserve">p (Holm)</w:t>
+            </w:r>
+          </w:p>
+        </w:tc>
+      </w:tr>
+      <w:tr>
+        <w:tc>
+          <w:tcPr>
+            <w:tcW w:type="dxa" w:w="1700"/>
+            <w:tcBorders>
+              <w:top w:val="single" w:color="999999" w:sz="4"/>
+              <w:left w:val="single" w:color="999999" w:sz="4"/>
+              <w:bottom w:val="single" w:color="999999" w:sz="4"/>
+              <w:right w:val="single" w:color="999999" w:sz="4"/>
+            </w:tcBorders>
+            <w:tcMar>
+              <w:top w:type="dxa" w:w="40"/>
+              <w:left w:type="dxa" w:w="80"/>
+              <w:bottom w:type="dxa" w:w="40"/>
+              <w:right w:type="dxa" w:w="80"/>
+            </w:tcMar>
+          </w:tcPr>
+          <w:p>
+            <w:pPr>
+              <w:jc w:val="left"/>
+            </w:pPr>
+            <w:r>
+              <w:rPr>
+                <w:rFonts w:ascii="Times New Roman" w:cs="Times New Roman" w:eastAsia="Times New Roman" w:hAnsi="Times New Roman"/>
+                <w:b w:val="false"/>
+                <w:bCs w:val="false"/>
+                <w:sz w:val="18"/>
+                <w:szCs w:val="18"/>
+              </w:rPr>
+              <w:t xml:space="preserve">SD-QA-Whisper</w:t>
+            </w:r>
+          </w:p>
+        </w:tc>
+        <w:tc>
+          <w:tcPr>
+            <w:tcW w:type="dxa" w:w="900"/>
+            <w:tcBorders>
+              <w:top w:val="single" w:color="999999" w:sz="4"/>
+              <w:left w:val="single" w:color="999999" w:sz="4"/>
+              <w:bottom w:val="single" w:color="999999" w:sz="4"/>
+              <w:right w:val="single" w:color="999999" w:sz="4"/>
+            </w:tcBorders>
+            <w:tcMar>
+              <w:top w:type="dxa" w:w="40"/>
+              <w:left w:type="dxa" w:w="80"/>
+              <w:bottom w:type="dxa" w:w="40"/>
+              <w:right w:type="dxa" w:w="80"/>
+            </w:tcMar>
+          </w:tcPr>
+          <w:p>
+            <w:pPr>
+              <w:jc w:val="center"/>
+            </w:pPr>
+            <w:r>
+              <w:rPr>
+                <w:rFonts w:ascii="Times New Roman" w:cs="Times New Roman" w:eastAsia="Times New Roman" w:hAnsi="Times New Roman"/>
+                <w:b w:val="false"/>
+                <w:bCs w:val="false"/>
+                <w:sz w:val="18"/>
+                <w:szCs w:val="18"/>
+              </w:rPr>
+              <w:t xml:space="preserve">704</w:t>
+            </w:r>
+          </w:p>
+        </w:tc>
+        <w:tc>
+          <w:tcPr>
+            <w:tcW w:type="dxa" w:w="900"/>
+            <w:tcBorders>
+              <w:top w:val="single" w:color="999999" w:sz="4"/>
+              <w:left w:val="single" w:color="999999" w:sz="4"/>
+              <w:bottom w:val="single" w:color="999999" w:sz="4"/>
+              <w:right w:val="single" w:color="999999" w:sz="4"/>
+            </w:tcBorders>
+            <w:tcMar>
+              <w:top w:type="dxa" w:w="40"/>
+              <w:left w:type="dxa" w:w="80"/>
+              <w:bottom w:type="dxa" w:w="40"/>
+              <w:right w:type="dxa" w:w="80"/>
+            </w:tcMar>
+          </w:tcPr>
+          <w:p>
+            <w:pPr>
+              <w:jc w:val="center"/>
+            </w:pPr>
+            <w:r>
+              <w:rPr>
+                <w:rFonts w:ascii="Times New Roman" w:cs="Times New Roman" w:eastAsia="Times New Roman" w:hAnsi="Times New Roman"/>
+                <w:b w:val="false"/>
+                <w:bCs w:val="false"/>
+                <w:sz w:val="18"/>
+                <w:szCs w:val="18"/>
+              </w:rPr>
+              <w:t xml:space="preserve">0.286</w:t>
+            </w:r>
+          </w:p>
+        </w:tc>
+        <w:tc>
+          <w:tcPr>
+            <w:tcW w:type="dxa" w:w="900"/>
+            <w:tcBorders>
+              <w:top w:val="single" w:color="999999" w:sz="4"/>
+              <w:left w:val="single" w:color="999999" w:sz="4"/>
+              <w:bottom w:val="single" w:color="999999" w:sz="4"/>
+              <w:right w:val="single" w:color="999999" w:sz="4"/>
+            </w:tcBorders>
+            <w:tcMar>
+              <w:top w:type="dxa" w:w="40"/>
+              <w:left w:type="dxa" w:w="80"/>
+              <w:bottom w:type="dxa" w:w="40"/>
+              <w:right w:type="dxa" w:w="80"/>
+            </w:tcMar>
+          </w:tcPr>
+          <w:p>
+            <w:pPr>
+              <w:jc w:val="center"/>
+            </w:pPr>
+            <w:r>
+              <w:rPr>
+                <w:rFonts w:ascii="Times New Roman" w:cs="Times New Roman" w:eastAsia="Times New Roman" w:hAnsi="Times New Roman"/>
+                <w:b w:val="false"/>
+                <w:bCs w:val="false"/>
+                <w:sz w:val="18"/>
+                <w:szCs w:val="18"/>
+              </w:rPr>
+              <w:t xml:space="preserve">0.489</w:t>
+            </w:r>
+          </w:p>
+        </w:tc>
+        <w:tc>
+          <w:tcPr>
+            <w:tcW w:type="dxa" w:w="1100"/>
+            <w:tcBorders>
+              <w:top w:val="single" w:color="999999" w:sz="4"/>
+              <w:left w:val="single" w:color="999999" w:sz="4"/>
+              <w:bottom w:val="single" w:color="999999" w:sz="4"/>
+              <w:right w:val="single" w:color="999999" w:sz="4"/>
+            </w:tcBorders>
+            <w:tcMar>
+              <w:top w:type="dxa" w:w="40"/>
+              <w:left w:type="dxa" w:w="80"/>
+              <w:bottom w:type="dxa" w:w="40"/>
+              <w:right w:type="dxa" w:w="80"/>
+            </w:tcMar>
+          </w:tcPr>
+          <w:p>
+            <w:pPr>
+              <w:jc w:val="center"/>
+            </w:pPr>
+            <w:r>
+              <w:rPr>
+                <w:rFonts w:ascii="Times New Roman" w:cs="Times New Roman" w:eastAsia="Times New Roman" w:hAnsi="Times New Roman"/>
+                <w:b w:val="false"/>
+                <w:bCs w:val="false"/>
+                <w:sz w:val="18"/>
+                <w:szCs w:val="18"/>
+              </w:rPr>
+              <w:t xml:space="preserve">0.469</w:t>
+            </w:r>
+          </w:p>
+        </w:tc>
+        <w:tc>
+          <w:tcPr>
+            <w:tcW w:type="dxa" w:w="1200"/>
+            <w:tcBorders>
+              <w:top w:val="single" w:color="999999" w:sz="4"/>
+              <w:left w:val="single" w:color="999999" w:sz="4"/>
+              <w:bottom w:val="single" w:color="999999" w:sz="4"/>
+              <w:right w:val="single" w:color="999999" w:sz="4"/>
+            </w:tcBorders>
+            <w:tcMar>
+              <w:top w:type="dxa" w:w="40"/>
+              <w:left w:type="dxa" w:w="80"/>
+              <w:bottom w:type="dxa" w:w="40"/>
+              <w:right w:type="dxa" w:w="80"/>
+            </w:tcMar>
+          </w:tcPr>
+          <w:p>
+            <w:pPr>
+              <w:jc w:val="center"/>
+            </w:pPr>
+            <w:r>
+              <w:rPr>
+                <w:rFonts w:ascii="Times New Roman" w:cs="Times New Roman" w:eastAsia="Times New Roman" w:hAnsi="Times New Roman"/>
+                <w:b w:val="false"/>
+                <w:bCs w:val="false"/>
+                <w:sz w:val="18"/>
+                <w:szCs w:val="18"/>
+              </w:rPr>
+              <w:t xml:space="preserve">0.554</w:t>
+            </w:r>
+          </w:p>
+        </w:tc>
+        <w:tc>
+          <w:tcPr>
+            <w:tcW w:type="dxa" w:w="1000"/>
+            <w:tcBorders>
+              <w:top w:val="single" w:color="999999" w:sz="4"/>
+              <w:left w:val="single" w:color="999999" w:sz="4"/>
+              <w:bottom w:val="single" w:color="999999" w:sz="4"/>
+              <w:right w:val="single" w:color="999999" w:sz="4"/>
+            </w:tcBorders>
+            <w:tcMar>
+              <w:top w:type="dxa" w:w="40"/>
+              <w:left w:type="dxa" w:w="80"/>
+              <w:bottom w:type="dxa" w:w="40"/>
+              <w:right w:type="dxa" w:w="80"/>
+            </w:tcMar>
+          </w:tcPr>
+          <w:p>
+            <w:pPr>
+              <w:jc w:val="center"/>
+            </w:pPr>
+            <w:r>
+              <w:rPr>
+                <w:rFonts w:ascii="Times New Roman" w:cs="Times New Roman" w:eastAsia="Times New Roman" w:hAnsi="Times New Roman"/>
+                <w:b w:val="false"/>
+                <w:bCs w:val="false"/>
+                <w:sz w:val="18"/>
+                <w:szCs w:val="18"/>
+              </w:rPr>
+              <w:t xml:space="preserve">+0.085</w:t>
+            </w:r>
+          </w:p>
+        </w:tc>
+        <w:tc>
+          <w:tcPr>
+            <w:tcW w:type="dxa" w:w="1326"/>
+            <w:tcBorders>
+              <w:top w:val="single" w:color="999999" w:sz="4"/>
+              <w:left w:val="single" w:color="999999" w:sz="4"/>
+              <w:bottom w:val="single" w:color="999999" w:sz="4"/>
+              <w:right w:val="single" w:color="999999" w:sz="4"/>
+            </w:tcBorders>
+            <w:tcMar>
+              <w:top w:type="dxa" w:w="40"/>
+              <w:left w:type="dxa" w:w="80"/>
+              <w:bottom w:type="dxa" w:w="40"/>
+              <w:right w:type="dxa" w:w="80"/>
+            </w:tcMar>
+          </w:tcPr>
+          <w:p>
+            <w:pPr>
+              <w:jc w:val="center"/>
+            </w:pPr>
+            <w:r>
+              <w:rPr>
+                <w:rFonts w:ascii="Times New Roman" w:cs="Times New Roman" w:eastAsia="Times New Roman" w:hAnsi="Times New Roman"/>
+                <w:b w:val="false"/>
+                <w:bCs w:val="false"/>
+                <w:sz w:val="18"/>
+                <w:szCs w:val="18"/>
+              </w:rPr>
+              <w:t xml:space="preserve">&lt;0.001</w:t>
+            </w:r>
+          </w:p>
+        </w:tc>
+      </w:tr>
+      <w:tr>
+        <w:tc>
+          <w:tcPr>
+            <w:tcW w:type="dxa" w:w="1700"/>
+            <w:tcBorders>
+              <w:top w:val="single" w:color="999999" w:sz="4"/>
+              <w:left w:val="single" w:color="999999" w:sz="4"/>
+              <w:bottom w:val="single" w:color="999999" w:sz="4"/>
+              <w:right w:val="single" w:color="999999" w:sz="4"/>
+            </w:tcBorders>
+            <w:tcMar>
+              <w:top w:type="dxa" w:w="40"/>
+              <w:left w:type="dxa" w:w="80"/>
+              <w:bottom w:type="dxa" w:w="40"/>
+              <w:right w:type="dxa" w:w="80"/>
+            </w:tcMar>
+          </w:tcPr>
+          <w:p>
+            <w:pPr>
+              <w:jc w:val="left"/>
+            </w:pPr>
+            <w:r>
+              <w:rPr>
+                <w:rFonts w:ascii="Times New Roman" w:cs="Times New Roman" w:eastAsia="Times New Roman" w:hAnsi="Times New Roman"/>
+                <w:b w:val="false"/>
+                <w:bCs w:val="false"/>
+                <w:sz w:val="18"/>
+                <w:szCs w:val="18"/>
+              </w:rPr>
+              <w:t xml:space="preserve">HeySQuAD dev</w:t>
+            </w:r>
+          </w:p>
+        </w:tc>
+        <w:tc>
+          <w:tcPr>
+            <w:tcW w:type="dxa" w:w="900"/>
+            <w:tcBorders>
+              <w:top w:val="single" w:color="999999" w:sz="4"/>
+              <w:left w:val="single" w:color="999999" w:sz="4"/>
+              <w:bottom w:val="single" w:color="999999" w:sz="4"/>
+              <w:right w:val="single" w:color="999999" w:sz="4"/>
+            </w:tcBorders>
+            <w:tcMar>
+              <w:top w:type="dxa" w:w="40"/>
+              <w:left w:type="dxa" w:w="80"/>
+              <w:bottom w:type="dxa" w:w="40"/>
+              <w:right w:type="dxa" w:w="80"/>
+            </w:tcMar>
+          </w:tcPr>
+          <w:p>
+            <w:pPr>
+              <w:jc w:val="center"/>
+            </w:pPr>
+            <w:r>
+              <w:rPr>
+                <w:rFonts w:ascii="Times New Roman" w:cs="Times New Roman" w:eastAsia="Times New Roman" w:hAnsi="Times New Roman"/>
+                <w:b w:val="false"/>
+                <w:bCs w:val="false"/>
+                <w:sz w:val="18"/>
+                <w:szCs w:val="18"/>
+              </w:rPr>
+              <w:t xml:space="preserve">1,002</w:t>
+            </w:r>
+          </w:p>
+        </w:tc>
+        <w:tc>
+          <w:tcPr>
+            <w:tcW w:type="dxa" w:w="900"/>
+            <w:tcBorders>
+              <w:top w:val="single" w:color="999999" w:sz="4"/>
+              <w:left w:val="single" w:color="999999" w:sz="4"/>
+              <w:bottom w:val="single" w:color="999999" w:sz="4"/>
+              <w:right w:val="single" w:color="999999" w:sz="4"/>
+            </w:tcBorders>
+            <w:tcMar>
+              <w:top w:type="dxa" w:w="40"/>
+              <w:left w:type="dxa" w:w="80"/>
+              <w:bottom w:type="dxa" w:w="40"/>
+              <w:right w:type="dxa" w:w="80"/>
+            </w:tcMar>
+          </w:tcPr>
+          <w:p>
+            <w:pPr>
+              <w:jc w:val="center"/>
+            </w:pPr>
+            <w:r>
+              <w:rPr>
+                <w:rFonts w:ascii="Times New Roman" w:cs="Times New Roman" w:eastAsia="Times New Roman" w:hAnsi="Times New Roman"/>
+                <w:b w:val="false"/>
+                <w:bCs w:val="false"/>
+                <w:sz w:val="18"/>
+                <w:szCs w:val="18"/>
+              </w:rPr>
+              <w:t xml:space="preserve">0.853</w:t>
+            </w:r>
+          </w:p>
+        </w:tc>
+        <w:tc>
+          <w:tcPr>
+            <w:tcW w:type="dxa" w:w="900"/>
+            <w:tcBorders>
+              <w:top w:val="single" w:color="999999" w:sz="4"/>
+              <w:left w:val="single" w:color="999999" w:sz="4"/>
+              <w:bottom w:val="single" w:color="999999" w:sz="4"/>
+              <w:right w:val="single" w:color="999999" w:sz="4"/>
+            </w:tcBorders>
+            <w:tcMar>
+              <w:top w:type="dxa" w:w="40"/>
+              <w:left w:type="dxa" w:w="80"/>
+              <w:bottom w:type="dxa" w:w="40"/>
+              <w:right w:type="dxa" w:w="80"/>
+            </w:tcMar>
+          </w:tcPr>
+          <w:p>
+            <w:pPr>
+              <w:jc w:val="center"/>
+            </w:pPr>
+            <w:r>
+              <w:rPr>
+                <w:rFonts w:ascii="Times New Roman" w:cs="Times New Roman" w:eastAsia="Times New Roman" w:hAnsi="Times New Roman"/>
+                <w:b w:val="false"/>
+                <w:bCs w:val="false"/>
+                <w:sz w:val="18"/>
+                <w:szCs w:val="18"/>
+              </w:rPr>
+              <w:t xml:space="preserve">0.740</w:t>
+            </w:r>
+          </w:p>
+        </w:tc>
+        <w:tc>
+          <w:tcPr>
+            <w:tcW w:type="dxa" w:w="1100"/>
+            <w:tcBorders>
+              <w:top w:val="single" w:color="999999" w:sz="4"/>
+              <w:left w:val="single" w:color="999999" w:sz="4"/>
+              <w:bottom w:val="single" w:color="999999" w:sz="4"/>
+              <w:right w:val="single" w:color="999999" w:sz="4"/>
+            </w:tcBorders>
+            <w:tcMar>
+              <w:top w:type="dxa" w:w="40"/>
+              <w:left w:type="dxa" w:w="80"/>
+              <w:bottom w:type="dxa" w:w="40"/>
+              <w:right w:type="dxa" w:w="80"/>
+            </w:tcMar>
+          </w:tcPr>
+          <w:p>
+            <w:pPr>
+              <w:jc w:val="center"/>
+            </w:pPr>
+            <w:r>
+              <w:rPr>
+                <w:rFonts w:ascii="Times New Roman" w:cs="Times New Roman" w:eastAsia="Times New Roman" w:hAnsi="Times New Roman"/>
+                <w:b w:val="false"/>
+                <w:bCs w:val="false"/>
+                <w:sz w:val="18"/>
+                <w:szCs w:val="18"/>
+              </w:rPr>
+              <w:t xml:space="preserve">0.896</w:t>
+            </w:r>
+          </w:p>
+        </w:tc>
+        <w:tc>
+          <w:tcPr>
+            <w:tcW w:type="dxa" w:w="1200"/>
+            <w:tcBorders>
+              <w:top w:val="single" w:color="999999" w:sz="4"/>
+              <w:left w:val="single" w:color="999999" w:sz="4"/>
+              <w:bottom w:val="single" w:color="999999" w:sz="4"/>
+              <w:right w:val="single" w:color="999999" w:sz="4"/>
+            </w:tcBorders>
+            <w:tcMar>
+              <w:top w:type="dxa" w:w="40"/>
+              <w:left w:type="dxa" w:w="80"/>
+              <w:bottom w:type="dxa" w:w="40"/>
+              <w:right w:type="dxa" w:w="80"/>
+            </w:tcMar>
+          </w:tcPr>
+          <w:p>
+            <w:pPr>
+              <w:jc w:val="center"/>
+            </w:pPr>
+            <w:r>
+              <w:rPr>
+                <w:rFonts w:ascii="Times New Roman" w:cs="Times New Roman" w:eastAsia="Times New Roman" w:hAnsi="Times New Roman"/>
+                <w:b w:val="false"/>
+                <w:bCs w:val="false"/>
+                <w:sz w:val="18"/>
+                <w:szCs w:val="18"/>
+              </w:rPr>
+              <w:t xml:space="preserve">0.906</w:t>
+            </w:r>
+          </w:p>
+        </w:tc>
+        <w:tc>
+          <w:tcPr>
+            <w:tcW w:type="dxa" w:w="1000"/>
+            <w:tcBorders>
+              <w:top w:val="single" w:color="999999" w:sz="4"/>
+              <w:left w:val="single" w:color="999999" w:sz="4"/>
+              <w:bottom w:val="single" w:color="999999" w:sz="4"/>
+              <w:right w:val="single" w:color="999999" w:sz="4"/>
+            </w:tcBorders>
+            <w:tcMar>
+              <w:top w:type="dxa" w:w="40"/>
+              <w:left w:type="dxa" w:w="80"/>
+              <w:bottom w:type="dxa" w:w="40"/>
+              <w:right w:type="dxa" w:w="80"/>
+            </w:tcMar>
+          </w:tcPr>
+          <w:p>
+            <w:pPr>
+              <w:jc w:val="center"/>
+            </w:pPr>
+            <w:r>
+              <w:rPr>
+                <w:rFonts w:ascii="Times New Roman" w:cs="Times New Roman" w:eastAsia="Times New Roman" w:hAnsi="Times New Roman"/>
+                <w:b w:val="false"/>
+                <w:bCs w:val="false"/>
+                <w:sz w:val="18"/>
+                <w:szCs w:val="18"/>
+              </w:rPr>
+              <w:t xml:space="preserve">+0.010</w:t>
+            </w:r>
+          </w:p>
+        </w:tc>
+        <w:tc>
+          <w:tcPr>
+            <w:tcW w:type="dxa" w:w="1326"/>
+            <w:tcBorders>
+              <w:top w:val="single" w:color="999999" w:sz="4"/>
+              <w:left w:val="single" w:color="999999" w:sz="4"/>
+              <w:bottom w:val="single" w:color="999999" w:sz="4"/>
+              <w:right w:val="single" w:color="999999" w:sz="4"/>
+            </w:tcBorders>
+            <w:tcMar>
+              <w:top w:type="dxa" w:w="40"/>
+              <w:left w:type="dxa" w:w="80"/>
+              <w:bottom w:type="dxa" w:w="40"/>
+              <w:right w:type="dxa" w:w="80"/>
+            </w:tcMar>
+          </w:tcPr>
+          <w:p>
+            <w:pPr>
+              <w:jc w:val="center"/>
+            </w:pPr>
+            <w:r>
+              <w:rPr>
+                <w:rFonts w:ascii="Times New Roman" w:cs="Times New Roman" w:eastAsia="Times New Roman" w:hAnsi="Times New Roman"/>
+                <w:b w:val="false"/>
+                <w:bCs w:val="false"/>
+                <w:sz w:val="18"/>
+                <w:szCs w:val="18"/>
+              </w:rPr>
+              <w:t xml:space="preserve">0.023</w:t>
+            </w:r>
+          </w:p>
+        </w:tc>
+      </w:tr>
+      <w:tr>
+        <w:tc>
+          <w:tcPr>
+            <w:tcW w:type="dxa" w:w="1700"/>
+            <w:tcBorders>
+              <w:top w:val="single" w:color="999999" w:sz="4"/>
+              <w:left w:val="single" w:color="999999" w:sz="4"/>
+              <w:bottom w:val="single" w:color="999999" w:sz="4"/>
+              <w:right w:val="single" w:color="999999" w:sz="4"/>
+            </w:tcBorders>
+            <w:tcMar>
+              <w:top w:type="dxa" w:w="40"/>
+              <w:left w:type="dxa" w:w="80"/>
+              <w:bottom w:type="dxa" w:w="40"/>
+              <w:right w:type="dxa" w:w="80"/>
+            </w:tcMar>
+          </w:tcPr>
+          <w:p>
+            <w:pPr>
+              <w:jc w:val="left"/>
+            </w:pPr>
+            <w:r>
+              <w:rPr>
+                <w:rFonts w:ascii="Times New Roman" w:cs="Times New Roman" w:eastAsia="Times New Roman" w:hAnsi="Times New Roman"/>
+                <w:b w:val="false"/>
+                <w:bCs w:val="false"/>
+                <w:sz w:val="18"/>
+                <w:szCs w:val="18"/>
+              </w:rPr>
+              <w:t xml:space="preserve">SLUE-SQA-5 test</w:t>
+            </w:r>
+          </w:p>
+        </w:tc>
+        <w:tc>
+          <w:tcPr>
+            <w:tcW w:type="dxa" w:w="900"/>
+            <w:tcBorders>
+              <w:top w:val="single" w:color="999999" w:sz="4"/>
+              <w:left w:val="single" w:color="999999" w:sz="4"/>
+              <w:bottom w:val="single" w:color="999999" w:sz="4"/>
+              <w:right w:val="single" w:color="999999" w:sz="4"/>
+            </w:tcBorders>
+            <w:tcMar>
+              <w:top w:type="dxa" w:w="40"/>
+              <w:left w:type="dxa" w:w="80"/>
+              <w:bottom w:type="dxa" w:w="40"/>
+              <w:right w:type="dxa" w:w="80"/>
+            </w:tcMar>
+          </w:tcPr>
+          <w:p>
+            <w:pPr>
+              <w:jc w:val="center"/>
+            </w:pPr>
+            <w:r>
+              <w:rPr>
+                <w:rFonts w:ascii="Times New Roman" w:cs="Times New Roman" w:eastAsia="Times New Roman" w:hAnsi="Times New Roman"/>
+                <w:b w:val="false"/>
+                <w:bCs w:val="false"/>
+                <w:sz w:val="18"/>
+                <w:szCs w:val="18"/>
+              </w:rPr>
+              <w:t xml:space="preserve">2,382</w:t>
+            </w:r>
+          </w:p>
+        </w:tc>
+        <w:tc>
+          <w:tcPr>
+            <w:tcW w:type="dxa" w:w="900"/>
+            <w:tcBorders>
+              <w:top w:val="single" w:color="999999" w:sz="4"/>
+              <w:left w:val="single" w:color="999999" w:sz="4"/>
+              <w:bottom w:val="single" w:color="999999" w:sz="4"/>
+              <w:right w:val="single" w:color="999999" w:sz="4"/>
+            </w:tcBorders>
+            <w:tcMar>
+              <w:top w:type="dxa" w:w="40"/>
+              <w:left w:type="dxa" w:w="80"/>
+              <w:bottom w:type="dxa" w:w="40"/>
+              <w:right w:type="dxa" w:w="80"/>
+            </w:tcMar>
+          </w:tcPr>
+          <w:p>
+            <w:pPr>
+              <w:jc w:val="center"/>
+            </w:pPr>
+            <w:r>
+              <w:rPr>
+                <w:rFonts w:ascii="Times New Roman" w:cs="Times New Roman" w:eastAsia="Times New Roman" w:hAnsi="Times New Roman"/>
+                <w:b w:val="false"/>
+                <w:bCs w:val="false"/>
+                <w:sz w:val="18"/>
+                <w:szCs w:val="18"/>
+              </w:rPr>
+              <w:t xml:space="preserve">0.332</w:t>
+            </w:r>
+          </w:p>
+        </w:tc>
+        <w:tc>
+          <w:tcPr>
+            <w:tcW w:type="dxa" w:w="900"/>
+            <w:tcBorders>
+              <w:top w:val="single" w:color="999999" w:sz="4"/>
+              <w:left w:val="single" w:color="999999" w:sz="4"/>
+              <w:bottom w:val="single" w:color="999999" w:sz="4"/>
+              <w:right w:val="single" w:color="999999" w:sz="4"/>
+            </w:tcBorders>
+            <w:tcMar>
+              <w:top w:type="dxa" w:w="40"/>
+              <w:left w:type="dxa" w:w="80"/>
+              <w:bottom w:type="dxa" w:w="40"/>
+              <w:right w:type="dxa" w:w="80"/>
+            </w:tcMar>
+          </w:tcPr>
+          <w:p>
+            <w:pPr>
+              <w:jc w:val="center"/>
+            </w:pPr>
+            <w:r>
+              <w:rPr>
+                <w:rFonts w:ascii="Times New Roman" w:cs="Times New Roman" w:eastAsia="Times New Roman" w:hAnsi="Times New Roman"/>
+                <w:b w:val="false"/>
+                <w:bCs w:val="false"/>
+                <w:sz w:val="18"/>
+                <w:szCs w:val="18"/>
+              </w:rPr>
+              <w:t xml:space="preserve">0.393</w:t>
+            </w:r>
+          </w:p>
+        </w:tc>
+        <w:tc>
+          <w:tcPr>
+            <w:tcW w:type="dxa" w:w="1100"/>
+            <w:tcBorders>
+              <w:top w:val="single" w:color="999999" w:sz="4"/>
+              <w:left w:val="single" w:color="999999" w:sz="4"/>
+              <w:bottom w:val="single" w:color="999999" w:sz="4"/>
+              <w:right w:val="single" w:color="999999" w:sz="4"/>
+            </w:tcBorders>
+            <w:tcMar>
+              <w:top w:type="dxa" w:w="40"/>
+              <w:left w:type="dxa" w:w="80"/>
+              <w:bottom w:type="dxa" w:w="40"/>
+              <w:right w:type="dxa" w:w="80"/>
+            </w:tcMar>
+          </w:tcPr>
+          <w:p>
+            <w:pPr>
+              <w:jc w:val="center"/>
+            </w:pPr>
+            <w:r>
+              <w:rPr>
+                <w:rFonts w:ascii="Times New Roman" w:cs="Times New Roman" w:eastAsia="Times New Roman" w:hAnsi="Times New Roman"/>
+                <w:b w:val="false"/>
+                <w:bCs w:val="false"/>
+                <w:sz w:val="18"/>
+                <w:szCs w:val="18"/>
+              </w:rPr>
+              <w:t xml:space="preserve">0.469</w:t>
+            </w:r>
+          </w:p>
+        </w:tc>
+        <w:tc>
+          <w:tcPr>
+            <w:tcW w:type="dxa" w:w="1200"/>
+            <w:tcBorders>
+              <w:top w:val="single" w:color="999999" w:sz="4"/>
+              <w:left w:val="single" w:color="999999" w:sz="4"/>
+              <w:bottom w:val="single" w:color="999999" w:sz="4"/>
+              <w:right w:val="single" w:color="999999" w:sz="4"/>
+            </w:tcBorders>
+            <w:tcMar>
+              <w:top w:type="dxa" w:w="40"/>
+              <w:left w:type="dxa" w:w="80"/>
+              <w:bottom w:type="dxa" w:w="40"/>
+              <w:right w:type="dxa" w:w="80"/>
+            </w:tcMar>
+          </w:tcPr>
+          <w:p>
+            <w:pPr>
+              <w:jc w:val="center"/>
+            </w:pPr>
+            <w:r>
+              <w:rPr>
+                <w:rFonts w:ascii="Times New Roman" w:cs="Times New Roman" w:eastAsia="Times New Roman" w:hAnsi="Times New Roman"/>
+                <w:b w:val="false"/>
+                <w:bCs w:val="false"/>
+                <w:sz w:val="18"/>
+                <w:szCs w:val="18"/>
+              </w:rPr>
+              <w:t xml:space="preserve">0.515</w:t>
+            </w:r>
+          </w:p>
+        </w:tc>
+        <w:tc>
+          <w:tcPr>
+            <w:tcW w:type="dxa" w:w="1000"/>
+            <w:tcBorders>
+              <w:top w:val="single" w:color="999999" w:sz="4"/>
+              <w:left w:val="single" w:color="999999" w:sz="4"/>
+              <w:bottom w:val="single" w:color="999999" w:sz="4"/>
+              <w:right w:val="single" w:color="999999" w:sz="4"/>
+            </w:tcBorders>
+            <w:tcMar>
+              <w:top w:type="dxa" w:w="40"/>
+              <w:left w:type="dxa" w:w="80"/>
+              <w:bottom w:type="dxa" w:w="40"/>
+              <w:right w:type="dxa" w:w="80"/>
+            </w:tcMar>
+          </w:tcPr>
+          <w:p>
+            <w:pPr>
+              <w:jc w:val="center"/>
+            </w:pPr>
+            <w:r>
+              <w:rPr>
+                <w:rFonts w:ascii="Times New Roman" w:cs="Times New Roman" w:eastAsia="Times New Roman" w:hAnsi="Times New Roman"/>
+                <w:b w:val="false"/>
+                <w:bCs w:val="false"/>
+                <w:sz w:val="18"/>
+                <w:szCs w:val="18"/>
+              </w:rPr>
+              <w:t xml:space="preserve">+0.046</w:t>
+            </w:r>
+          </w:p>
+        </w:tc>
+        <w:tc>
+          <w:tcPr>
+            <w:tcW w:type="dxa" w:w="1326"/>
+            <w:tcBorders>
+              <w:top w:val="single" w:color="999999" w:sz="4"/>
+              <w:left w:val="single" w:color="999999" w:sz="4"/>
+              <w:bottom w:val="single" w:color="999999" w:sz="4"/>
+              <w:right w:val="single" w:color="999999" w:sz="4"/>
+            </w:tcBorders>
+            <w:tcMar>
+              <w:top w:type="dxa" w:w="40"/>
+              <w:left w:type="dxa" w:w="80"/>
+              <w:bottom w:type="dxa" w:w="40"/>
+              <w:right w:type="dxa" w:w="80"/>
+            </w:tcMar>
+          </w:tcPr>
+          <w:p>
+            <w:pPr>
+              <w:jc w:val="center"/>
+            </w:pPr>
+            <w:r>
+              <w:rPr>
+                <w:rFonts w:ascii="Times New Roman" w:cs="Times New Roman" w:eastAsia="Times New Roman" w:hAnsi="Times New Roman"/>
+                <w:b w:val="false"/>
+                <w:bCs w:val="false"/>
+                <w:sz w:val="18"/>
+                <w:szCs w:val="18"/>
+              </w:rPr>
+              <w:t xml:space="preserve">&lt;0.001</w:t>
+            </w:r>
+          </w:p>
+        </w:tc>
+      </w:tr>
+    </w:tbl>
+    <w:p>
+      <w:pPr>
+        <w:keepNext/>
+        <w:spacing w:before="120"/>
+        <w:jc w:val="center"/>
+      </w:pPr>
+      <w:r>
+        <w:drawing>
+          <wp:inline distT="0" distB="0" distL="0" distR="0">
+            <wp:extent cx="5334000" cy="1962150"/>
+            <wp:effectExtent t="0" r="0" b="0" l="0"/>
+            <wp:docPr id="8" name=""/>
+            <wp:cNvGraphicFramePr>
+              <a:graphicFrameLocks xmlns:a="http://schemas.openxmlformats.org/drawingml/2006/main" noChangeAspect="1"/>
+            </wp:cNvGraphicFramePr>
+            <a:graphic xmlns:a="http://schemas.openxmlformats.org/drawingml/2006/main">
+              <a:graphicData uri="http://schemas.openxmlformats.org/drawingml/2006/picture">
+                <pic:pic xmlns:pic="http://schemas.openxmlformats.org/drawingml/2006/picture">
+                  <pic:nvPicPr>
+                    <pic:cNvPr id="0" name="" descr=""/>
+                    <pic:cNvPicPr>
+                      <a:picLocks noChangeAspect="1" noChangeArrowheads="1"/>
+                    </pic:cNvPicPr>
+                  </pic:nvPicPr>
+                  <pic:blipFill>
+                    <a:blip r:embed="rId15" cstate="none"/>
+                    <a:srcRect/>
+                    <a:stretch>
+                      <a:fillRect/>
+                    </a:stretch>
+                  </pic:blipFill>
+                  <pic:spPr bwMode="auto">
+                    <a:xfrm>
+                      <a:off x="0" y="0"/>
+                      <a:ext cx="5334000" cy="1962150"/>
+                    </a:xfrm>
+                    <a:prstGeom prst="rect">
+                      <a:avLst/>
+                    </a:prstGeom>
+                  </pic:spPr>
+                </pic:pic>
+              </a:graphicData>
+            </a:graphic>
+          </wp:inline>
+        </w:drawing>
+      </w:r>
+    </w:p>
+    <w:p>
+      <w:pPr>
+        <w:spacing w:after="200" w:before="60"/>
+        <w:jc w:val="center"/>
+      </w:pPr>
+      <w:r>
+        <w:rPr>
+          <w:rFonts w:ascii="Times New Roman" w:cs="Times New Roman" w:eastAsia="Times New Roman" w:hAnsi="Times New Roman"/>
+          <w:i/>
+          <w:iCs/>
+          <w:sz w:val="19"/>
+          <w:szCs w:val="19"/>
+        </w:rPr>
+        <w:t xml:space="preserve">Fig. 8. Spoken-query nDCG@10 on the new real-speech test sets for BM25 and hybrid candidate lists re-ranked by MiniLM (ce-l6) and bge-reranker-v2-m3.</w:t>
+      </w:r>
+    </w:p>
+    <w:p>
+      <w:pPr>
+        <w:spacing w:after="120" w:before="0" w:line="276"/>
+        <w:jc w:val="both"/>
+      </w:pPr>
+      <w:r>
+        <w:rPr>
+          <w:rFonts w:ascii="Times New Roman" w:cs="Times New Roman" w:eastAsia="Times New Roman" w:hAnsi="Times New Roman"/>
+          <w:b/>
+          <w:bCs/>
+          <w:sz w:val="22"/>
+          <w:szCs w:val="22"/>
+        </w:rPr>
+        <w:t xml:space="preserve">Real vs. synthetic training noise (C3, not supported). </w:t>
+      </w:r>
+      <w:r>
+        <w:rPr>
+          <w:rFonts w:ascii="Times New Roman" w:cs="Times New Roman" w:eastAsia="Times New Roman" w:hAnsi="Times New Roman"/>
+          <w:sz w:val="22"/>
+          <w:szCs w:val="22"/>
+        </w:rPr>
+        <w:t xml:space="preserve">We predicted that training on real human speech errors would transfer to real accented speech better than training on synthetic TTS errors. The opposite held (Table XIII, Fig. 9). On the same 1,985 HeySQuAD questions, models trained on synthetic-speech transcripts were never worse than those trained on real-speech transcripts, and on SLUE-SQA-5 they were significantly better (FT-noisy: 0.447 vs. 0.385; distillation: 0.467 vs. 0.421; p &lt; 0.001). The real transcripts had twice the word error rate of the synthetic ones (0.150 vs. 0.075), so more of them no longer expressed the question; label noise, not realism, appears to dominate at this scale. Labelled fine-tuning on HeySQuAD again fell below the zero-shot model on every out-of-domain set, while distillation was the only variant to exceed it (on SD-QA-Whisper).</w:t>
+      </w:r>
+    </w:p>
+    <w:p>
+      <w:pPr>
+        <w:keepNext/>
+        <w:spacing w:after="80" w:before="160"/>
+        <w:jc w:val="center"/>
+      </w:pPr>
+      <w:r>
+        <w:rPr>
+          <w:rFonts w:ascii="Times New Roman" w:cs="Times New Roman" w:eastAsia="Times New Roman" w:hAnsi="Times New Roman"/>
+          <w:b/>
+          <w:bCs/>
+          <w:sz w:val="19"/>
+          <w:szCs w:val="19"/>
+        </w:rPr>
+        <w:t xml:space="preserve">TABLE XIII. C3: ce-l6 trained on 1,985 HeySQuAD questions (nDCG@10, mean of 3 seeds). Real vs. synthetic: Holm over 6 tests</w:t>
+      </w:r>
+    </w:p>
+    <w:tbl>
+      <w:tblPr>
+        <w:tblW w:type="dxa" w:w="9026"/>
+        <w:jc w:val="center"/>
+        <w:tblBorders>
+          <w:top w:val="single" w:color="auto" w:sz="4"/>
+          <w:left w:val="single" w:color="auto" w:sz="4"/>
+          <w:bottom w:val="single" w:color="auto" w:sz="4"/>
+          <w:right w:val="single" w:color="auto" w:sz="4"/>
+          <w:insideH w:val="single" w:color="auto" w:sz="4"/>
+          <w:insideV w:val="single" w:color="auto" w:sz="4"/>
+        </w:tblBorders>
+      </w:tblPr>
+      <w:tblGrid>
+        <w:gridCol w:w="2026"/>
+        <w:gridCol w:w="1100"/>
+        <w:gridCol w:w="1100"/>
+        <w:gridCol w:w="1200"/>
+        <w:gridCol w:w="1200"/>
+        <w:gridCol w:w="1200"/>
+        <w:gridCol w:w="1200"/>
+      </w:tblGrid>
+      <w:tr>
+        <w:trPr>
+          <w:tblHeader/>
+        </w:trPr>
+        <w:tc>
+          <w:tcPr>
+            <w:tcW w:type="dxa" w:w="2026"/>
+            <w:tcBorders>
+              <w:top w:val="single" w:color="999999" w:sz="4"/>
+              <w:left w:val="single" w:color="999999" w:sz="4"/>
+              <w:bottom w:val="single" w:color="999999" w:sz="4"/>
+              <w:right w:val="single" w:color="999999" w:sz="4"/>
+            </w:tcBorders>
+            <w:shd w:fill="E8EEF4" w:color="auto" w:val="clear"/>
+            <w:tcMar>
+              <w:top w:type="dxa" w:w="40"/>
+              <w:left w:type="dxa" w:w="80"/>
+              <w:bottom w:type="dxa" w:w="40"/>
+              <w:right w:type="dxa" w:w="80"/>
+            </w:tcMar>
+          </w:tcPr>
+          <w:p>
+            <w:pPr>
+              <w:jc w:val="left"/>
+            </w:pPr>
+            <w:r>
+              <w:rPr>
+                <w:rFonts w:ascii="Times New Roman" w:cs="Times New Roman" w:eastAsia="Times New Roman" w:hAnsi="Times New Roman"/>
+                <w:b/>
+                <w:bCs/>
+                <w:sz w:val="18"/>
+                <w:szCs w:val="18"/>
+              </w:rPr>
+              <w:t xml:space="preserve">Test set</w:t>
+            </w:r>
+          </w:p>
+        </w:tc>
+        <w:tc>
+          <w:tcPr>
+            <w:tcW w:type="dxa" w:w="1100"/>
+            <w:tcBorders>
+              <w:top w:val="single" w:color="999999" w:sz="4"/>
+              <w:left w:val="single" w:color="999999" w:sz="4"/>
+              <w:bottom w:val="single" w:color="999999" w:sz="4"/>
+              <w:right w:val="single" w:color="999999" w:sz="4"/>
+            </w:tcBorders>
+            <w:shd w:fill="E8EEF4" w:color="auto" w:val="clear"/>
+            <w:tcMar>
+              <w:top w:type="dxa" w:w="40"/>
+              <w:left w:type="dxa" w:w="80"/>
+              <w:bottom w:type="dxa" w:w="40"/>
+              <w:right w:type="dxa" w:w="80"/>
+            </w:tcMar>
+          </w:tcPr>
+          <w:p>
+            <w:pPr>
+              <w:jc w:val="center"/>
+            </w:pPr>
+            <w:r>
+              <w:rPr>
+                <w:rFonts w:ascii="Times New Roman" w:cs="Times New Roman" w:eastAsia="Times New Roman" w:hAnsi="Times New Roman"/>
+                <w:b/>
+                <w:bCs/>
+                <w:sz w:val="18"/>
+                <w:szCs w:val="18"/>
+              </w:rPr>
+              <w:t xml:space="preserve">Zero-shot</w:t>
+            </w:r>
+          </w:p>
+        </w:tc>
+        <w:tc>
+          <w:tcPr>
+            <w:tcW w:type="dxa" w:w="1100"/>
+            <w:tcBorders>
+              <w:top w:val="single" w:color="999999" w:sz="4"/>
+              <w:left w:val="single" w:color="999999" w:sz="4"/>
+              <w:bottom w:val="single" w:color="999999" w:sz="4"/>
+              <w:right w:val="single" w:color="999999" w:sz="4"/>
+            </w:tcBorders>
+            <w:shd w:fill="E8EEF4" w:color="auto" w:val="clear"/>
+            <w:tcMar>
+              <w:top w:type="dxa" w:w="40"/>
+              <w:left w:type="dxa" w:w="80"/>
+              <w:bottom w:type="dxa" w:w="40"/>
+              <w:right w:type="dxa" w:w="80"/>
+            </w:tcMar>
+          </w:tcPr>
+          <w:p>
+            <w:pPr>
+              <w:jc w:val="center"/>
+            </w:pPr>
+            <w:r>
+              <w:rPr>
+                <w:rFonts w:ascii="Times New Roman" w:cs="Times New Roman" w:eastAsia="Times New Roman" w:hAnsi="Times New Roman"/>
+                <w:b/>
+                <w:bCs/>
+                <w:sz w:val="18"/>
+                <w:szCs w:val="18"/>
+              </w:rPr>
+              <w:t xml:space="preserve">FT-clean</w:t>
+            </w:r>
+          </w:p>
+        </w:tc>
+        <w:tc>
+          <w:tcPr>
+            <w:tcW w:type="dxa" w:w="1200"/>
+            <w:tcBorders>
+              <w:top w:val="single" w:color="999999" w:sz="4"/>
+              <w:left w:val="single" w:color="999999" w:sz="4"/>
+              <w:bottom w:val="single" w:color="999999" w:sz="4"/>
+              <w:right w:val="single" w:color="999999" w:sz="4"/>
+            </w:tcBorders>
+            <w:shd w:fill="E8EEF4" w:color="auto" w:val="clear"/>
+            <w:tcMar>
+              <w:top w:type="dxa" w:w="40"/>
+              <w:left w:type="dxa" w:w="80"/>
+              <w:bottom w:type="dxa" w:w="40"/>
+              <w:right w:type="dxa" w:w="80"/>
+            </w:tcMar>
+          </w:tcPr>
+          <w:p>
+            <w:pPr>
+              <w:jc w:val="center"/>
+            </w:pPr>
+            <w:r>
+              <w:rPr>
+                <w:rFonts w:ascii="Times New Roman" w:cs="Times New Roman" w:eastAsia="Times New Roman" w:hAnsi="Times New Roman"/>
+                <w:b/>
+                <w:bCs/>
+                <w:sz w:val="18"/>
+                <w:szCs w:val="18"/>
+              </w:rPr>
+              <w:t xml:space="preserve">FT-noisy real</w:t>
+            </w:r>
+          </w:p>
+        </w:tc>
+        <w:tc>
+          <w:tcPr>
+            <w:tcW w:type="dxa" w:w="1200"/>
+            <w:tcBorders>
+              <w:top w:val="single" w:color="999999" w:sz="4"/>
+              <w:left w:val="single" w:color="999999" w:sz="4"/>
+              <w:bottom w:val="single" w:color="999999" w:sz="4"/>
+              <w:right w:val="single" w:color="999999" w:sz="4"/>
+            </w:tcBorders>
+            <w:shd w:fill="E8EEF4" w:color="auto" w:val="clear"/>
+            <w:tcMar>
+              <w:top w:type="dxa" w:w="40"/>
+              <w:left w:type="dxa" w:w="80"/>
+              <w:bottom w:type="dxa" w:w="40"/>
+              <w:right w:type="dxa" w:w="80"/>
+            </w:tcMar>
+          </w:tcPr>
+          <w:p>
+            <w:pPr>
+              <w:jc w:val="center"/>
+            </w:pPr>
+            <w:r>
+              <w:rPr>
+                <w:rFonts w:ascii="Times New Roman" w:cs="Times New Roman" w:eastAsia="Times New Roman" w:hAnsi="Times New Roman"/>
+                <w:b/>
+                <w:bCs/>
+                <w:sz w:val="18"/>
+                <w:szCs w:val="18"/>
+              </w:rPr>
+              <w:t xml:space="preserve">FT-noisy synth</w:t>
+            </w:r>
+          </w:p>
+        </w:tc>
+        <w:tc>
+          <w:tcPr>
+            <w:tcW w:type="dxa" w:w="1200"/>
+            <w:tcBorders>
+              <w:top w:val="single" w:color="999999" w:sz="4"/>
+              <w:left w:val="single" w:color="999999" w:sz="4"/>
+              <w:bottom w:val="single" w:color="999999" w:sz="4"/>
+              <w:right w:val="single" w:color="999999" w:sz="4"/>
+            </w:tcBorders>
+            <w:shd w:fill="E8EEF4" w:color="auto" w:val="clear"/>
+            <w:tcMar>
+              <w:top w:type="dxa" w:w="40"/>
+              <w:left w:type="dxa" w:w="80"/>
+              <w:bottom w:type="dxa" w:w="40"/>
+              <w:right w:type="dxa" w:w="80"/>
+            </w:tcMar>
+          </w:tcPr>
+          <w:p>
+            <w:pPr>
+              <w:jc w:val="center"/>
+            </w:pPr>
+            <w:r>
+              <w:rPr>
+                <w:rFonts w:ascii="Times New Roman" w:cs="Times New Roman" w:eastAsia="Times New Roman" w:hAnsi="Times New Roman"/>
+                <w:b/>
+                <w:bCs/>
+                <w:sz w:val="18"/>
+                <w:szCs w:val="18"/>
+              </w:rPr>
+              <w:t xml:space="preserve">Distill real</w:t>
+            </w:r>
+          </w:p>
+        </w:tc>
+        <w:tc>
+          <w:tcPr>
+            <w:tcW w:type="dxa" w:w="1200"/>
+            <w:tcBorders>
+              <w:top w:val="single" w:color="999999" w:sz="4"/>
+              <w:left w:val="single" w:color="999999" w:sz="4"/>
+              <w:bottom w:val="single" w:color="999999" w:sz="4"/>
+              <w:right w:val="single" w:color="999999" w:sz="4"/>
+            </w:tcBorders>
+            <w:shd w:fill="E8EEF4" w:color="auto" w:val="clear"/>
+            <w:tcMar>
+              <w:top w:type="dxa" w:w="40"/>
+              <w:left w:type="dxa" w:w="80"/>
+              <w:bottom w:type="dxa" w:w="40"/>
+              <w:right w:type="dxa" w:w="80"/>
+            </w:tcMar>
+          </w:tcPr>
+          <w:p>
+            <w:pPr>
+              <w:jc w:val="center"/>
+            </w:pPr>
+            <w:r>
+              <w:rPr>
+                <w:rFonts w:ascii="Times New Roman" w:cs="Times New Roman" w:eastAsia="Times New Roman" w:hAnsi="Times New Roman"/>
+                <w:b/>
+                <w:bCs/>
+                <w:sz w:val="18"/>
+                <w:szCs w:val="18"/>
+              </w:rPr>
+              <w:t xml:space="preserve">Distill synth</w:t>
+            </w:r>
+          </w:p>
+        </w:tc>
+      </w:tr>
+      <w:tr>
+        <w:tc>
+          <w:tcPr>
+            <w:tcW w:type="dxa" w:w="2026"/>
+            <w:tcBorders>
+              <w:top w:val="single" w:color="999999" w:sz="4"/>
+              <w:left w:val="single" w:color="999999" w:sz="4"/>
+              <w:bottom w:val="single" w:color="999999" w:sz="4"/>
+              <w:right w:val="single" w:color="999999" w:sz="4"/>
+            </w:tcBorders>
+            <w:tcMar>
+              <w:top w:type="dxa" w:w="40"/>
+              <w:left w:type="dxa" w:w="80"/>
+              <w:bottom w:type="dxa" w:w="40"/>
+              <w:right w:type="dxa" w:w="80"/>
+            </w:tcMar>
+          </w:tcPr>
+          <w:p>
+            <w:pPr>
+              <w:jc w:val="left"/>
+            </w:pPr>
+            <w:r>
+              <w:rPr>
+                <w:rFonts w:ascii="Times New Roman" w:cs="Times New Roman" w:eastAsia="Times New Roman" w:hAnsi="Times New Roman"/>
+                <w:b w:val="false"/>
+                <w:bCs w:val="false"/>
+                <w:sz w:val="18"/>
+                <w:szCs w:val="18"/>
+              </w:rPr>
+              <w:t xml:space="preserve">SD-QA-Whisper</w:t>
+            </w:r>
+          </w:p>
+        </w:tc>
+        <w:tc>
+          <w:tcPr>
+            <w:tcW w:type="dxa" w:w="1100"/>
+            <w:tcBorders>
+              <w:top w:val="single" w:color="999999" w:sz="4"/>
+              <w:left w:val="single" w:color="999999" w:sz="4"/>
+              <w:bottom w:val="single" w:color="999999" w:sz="4"/>
+              <w:right w:val="single" w:color="999999" w:sz="4"/>
+            </w:tcBorders>
+            <w:tcMar>
+              <w:top w:type="dxa" w:w="40"/>
+              <w:left w:type="dxa" w:w="80"/>
+              <w:bottom w:type="dxa" w:w="40"/>
+              <w:right w:type="dxa" w:w="80"/>
+            </w:tcMar>
+          </w:tcPr>
+          <w:p>
+            <w:pPr>
+              <w:jc w:val="center"/>
+            </w:pPr>
+            <w:r>
+              <w:rPr>
+                <w:rFonts w:ascii="Times New Roman" w:cs="Times New Roman" w:eastAsia="Times New Roman" w:hAnsi="Times New Roman"/>
+                <w:b w:val="false"/>
+                <w:bCs w:val="false"/>
+                <w:sz w:val="18"/>
+                <w:szCs w:val="18"/>
+              </w:rPr>
+              <w:t xml:space="preserve">0.469</w:t>
+            </w:r>
+          </w:p>
+        </w:tc>
+        <w:tc>
+          <w:tcPr>
+            <w:tcW w:type="dxa" w:w="1100"/>
+            <w:tcBorders>
+              <w:top w:val="single" w:color="999999" w:sz="4"/>
+              <w:left w:val="single" w:color="999999" w:sz="4"/>
+              <w:bottom w:val="single" w:color="999999" w:sz="4"/>
+              <w:right w:val="single" w:color="999999" w:sz="4"/>
+            </w:tcBorders>
+            <w:tcMar>
+              <w:top w:type="dxa" w:w="40"/>
+              <w:left w:type="dxa" w:w="80"/>
+              <w:bottom w:type="dxa" w:w="40"/>
+              <w:right w:type="dxa" w:w="80"/>
+            </w:tcMar>
+          </w:tcPr>
+          <w:p>
+            <w:pPr>
+              <w:jc w:val="center"/>
+            </w:pPr>
+            <w:r>
+              <w:rPr>
+                <w:rFonts w:ascii="Times New Roman" w:cs="Times New Roman" w:eastAsia="Times New Roman" w:hAnsi="Times New Roman"/>
+                <w:b w:val="false"/>
+                <w:bCs w:val="false"/>
+                <w:sz w:val="18"/>
+                <w:szCs w:val="18"/>
+              </w:rPr>
+              <w:t xml:space="preserve">0.452</w:t>
+            </w:r>
+          </w:p>
+        </w:tc>
+        <w:tc>
+          <w:tcPr>
+            <w:tcW w:type="dxa" w:w="1200"/>
+            <w:tcBorders>
+              <w:top w:val="single" w:color="999999" w:sz="4"/>
+              <w:left w:val="single" w:color="999999" w:sz="4"/>
+              <w:bottom w:val="single" w:color="999999" w:sz="4"/>
+              <w:right w:val="single" w:color="999999" w:sz="4"/>
+            </w:tcBorders>
+            <w:tcMar>
+              <w:top w:type="dxa" w:w="40"/>
+              <w:left w:type="dxa" w:w="80"/>
+              <w:bottom w:type="dxa" w:w="40"/>
+              <w:right w:type="dxa" w:w="80"/>
+            </w:tcMar>
+          </w:tcPr>
+          <w:p>
+            <w:pPr>
+              <w:jc w:val="center"/>
+            </w:pPr>
+            <w:r>
+              <w:rPr>
+                <w:rFonts w:ascii="Times New Roman" w:cs="Times New Roman" w:eastAsia="Times New Roman" w:hAnsi="Times New Roman"/>
+                <w:b w:val="false"/>
+                <w:bCs w:val="false"/>
+                <w:sz w:val="18"/>
+                <w:szCs w:val="18"/>
+              </w:rPr>
+              <w:t xml:space="preserve">0.455</w:t>
+            </w:r>
+          </w:p>
+        </w:tc>
+        <w:tc>
+          <w:tcPr>
+            <w:tcW w:type="dxa" w:w="1200"/>
+            <w:tcBorders>
+              <w:top w:val="single" w:color="999999" w:sz="4"/>
+              <w:left w:val="single" w:color="999999" w:sz="4"/>
+              <w:bottom w:val="single" w:color="999999" w:sz="4"/>
+              <w:right w:val="single" w:color="999999" w:sz="4"/>
+            </w:tcBorders>
+            <w:tcMar>
+              <w:top w:type="dxa" w:w="40"/>
+              <w:left w:type="dxa" w:w="80"/>
+              <w:bottom w:type="dxa" w:w="40"/>
+              <w:right w:type="dxa" w:w="80"/>
+            </w:tcMar>
+          </w:tcPr>
+          <w:p>
+            <w:pPr>
+              <w:jc w:val="center"/>
+            </w:pPr>
+            <w:r>
+              <w:rPr>
+                <w:rFonts w:ascii="Times New Roman" w:cs="Times New Roman" w:eastAsia="Times New Roman" w:hAnsi="Times New Roman"/>
+                <w:b w:val="false"/>
+                <w:bCs w:val="false"/>
+                <w:sz w:val="18"/>
+                <w:szCs w:val="18"/>
+              </w:rPr>
+              <w:t xml:space="preserve">0.459</w:t>
+            </w:r>
+          </w:p>
+        </w:tc>
+        <w:tc>
+          <w:tcPr>
+            <w:tcW w:type="dxa" w:w="1200"/>
+            <w:tcBorders>
+              <w:top w:val="single" w:color="999999" w:sz="4"/>
+              <w:left w:val="single" w:color="999999" w:sz="4"/>
+              <w:bottom w:val="single" w:color="999999" w:sz="4"/>
+              <w:right w:val="single" w:color="999999" w:sz="4"/>
+            </w:tcBorders>
+            <w:tcMar>
+              <w:top w:type="dxa" w:w="40"/>
+              <w:left w:type="dxa" w:w="80"/>
+              <w:bottom w:type="dxa" w:w="40"/>
+              <w:right w:type="dxa" w:w="80"/>
+            </w:tcMar>
+          </w:tcPr>
+          <w:p>
+            <w:pPr>
+              <w:jc w:val="center"/>
+            </w:pPr>
+            <w:r>
+              <w:rPr>
+                <w:rFonts w:ascii="Times New Roman" w:cs="Times New Roman" w:eastAsia="Times New Roman" w:hAnsi="Times New Roman"/>
+                <w:b w:val="false"/>
+                <w:bCs w:val="false"/>
+                <w:sz w:val="18"/>
+                <w:szCs w:val="18"/>
+              </w:rPr>
+              <w:t xml:space="preserve">0.473</w:t>
+            </w:r>
+          </w:p>
+        </w:tc>
+        <w:tc>
+          <w:tcPr>
+            <w:tcW w:type="dxa" w:w="1200"/>
+            <w:tcBorders>
+              <w:top w:val="single" w:color="999999" w:sz="4"/>
+              <w:left w:val="single" w:color="999999" w:sz="4"/>
+              <w:bottom w:val="single" w:color="999999" w:sz="4"/>
+              <w:right w:val="single" w:color="999999" w:sz="4"/>
+            </w:tcBorders>
+            <w:tcMar>
+              <w:top w:type="dxa" w:w="40"/>
+              <w:left w:type="dxa" w:w="80"/>
+              <w:bottom w:type="dxa" w:w="40"/>
+              <w:right w:type="dxa" w:w="80"/>
+            </w:tcMar>
+          </w:tcPr>
+          <w:p>
+            <w:pPr>
+              <w:jc w:val="center"/>
+            </w:pPr>
+            <w:r>
+              <w:rPr>
+                <w:rFonts w:ascii="Times New Roman" w:cs="Times New Roman" w:eastAsia="Times New Roman" w:hAnsi="Times New Roman"/>
+                <w:b w:val="false"/>
+                <w:bCs w:val="false"/>
+                <w:sz w:val="18"/>
+                <w:szCs w:val="18"/>
+              </w:rPr>
+              <w:t xml:space="preserve">0.475</w:t>
+            </w:r>
+          </w:p>
+        </w:tc>
+      </w:tr>
+      <w:tr>
+        <w:tc>
+          <w:tcPr>
+            <w:tcW w:type="dxa" w:w="2026"/>
+            <w:tcBorders>
+              <w:top w:val="single" w:color="999999" w:sz="4"/>
+              <w:left w:val="single" w:color="999999" w:sz="4"/>
+              <w:bottom w:val="single" w:color="999999" w:sz="4"/>
+              <w:right w:val="single" w:color="999999" w:sz="4"/>
+            </w:tcBorders>
+            <w:tcMar>
+              <w:top w:type="dxa" w:w="40"/>
+              <w:left w:type="dxa" w:w="80"/>
+              <w:bottom w:type="dxa" w:w="40"/>
+              <w:right w:type="dxa" w:w="80"/>
+            </w:tcMar>
+          </w:tcPr>
+          <w:p>
+            <w:pPr>
+              <w:jc w:val="left"/>
+            </w:pPr>
+            <w:r>
+              <w:rPr>
+                <w:rFonts w:ascii="Times New Roman" w:cs="Times New Roman" w:eastAsia="Times New Roman" w:hAnsi="Times New Roman"/>
+                <w:b w:val="false"/>
+                <w:bCs w:val="false"/>
+                <w:sz w:val="18"/>
+                <w:szCs w:val="18"/>
+              </w:rPr>
+              <w:t xml:space="preserve">SD-QA-Whisper, Indian</w:t>
+            </w:r>
+          </w:p>
+        </w:tc>
+        <w:tc>
+          <w:tcPr>
+            <w:tcW w:type="dxa" w:w="1100"/>
+            <w:tcBorders>
+              <w:top w:val="single" w:color="999999" w:sz="4"/>
+              <w:left w:val="single" w:color="999999" w:sz="4"/>
+              <w:bottom w:val="single" w:color="999999" w:sz="4"/>
+              <w:right w:val="single" w:color="999999" w:sz="4"/>
+            </w:tcBorders>
+            <w:tcMar>
+              <w:top w:type="dxa" w:w="40"/>
+              <w:left w:type="dxa" w:w="80"/>
+              <w:bottom w:type="dxa" w:w="40"/>
+              <w:right w:type="dxa" w:w="80"/>
+            </w:tcMar>
+          </w:tcPr>
+          <w:p>
+            <w:pPr>
+              <w:jc w:val="center"/>
+            </w:pPr>
+            <w:r>
+              <w:rPr>
+                <w:rFonts w:ascii="Times New Roman" w:cs="Times New Roman" w:eastAsia="Times New Roman" w:hAnsi="Times New Roman"/>
+                <w:b w:val="false"/>
+                <w:bCs w:val="false"/>
+                <w:sz w:val="18"/>
+                <w:szCs w:val="18"/>
+              </w:rPr>
+              <w:t xml:space="preserve">0.448</w:t>
+            </w:r>
+          </w:p>
+        </w:tc>
+        <w:tc>
+          <w:tcPr>
+            <w:tcW w:type="dxa" w:w="1100"/>
+            <w:tcBorders>
+              <w:top w:val="single" w:color="999999" w:sz="4"/>
+              <w:left w:val="single" w:color="999999" w:sz="4"/>
+              <w:bottom w:val="single" w:color="999999" w:sz="4"/>
+              <w:right w:val="single" w:color="999999" w:sz="4"/>
+            </w:tcBorders>
+            <w:tcMar>
+              <w:top w:type="dxa" w:w="40"/>
+              <w:left w:type="dxa" w:w="80"/>
+              <w:bottom w:type="dxa" w:w="40"/>
+              <w:right w:type="dxa" w:w="80"/>
+            </w:tcMar>
+          </w:tcPr>
+          <w:p>
+            <w:pPr>
+              <w:jc w:val="center"/>
+            </w:pPr>
+            <w:r>
+              <w:rPr>
+                <w:rFonts w:ascii="Times New Roman" w:cs="Times New Roman" w:eastAsia="Times New Roman" w:hAnsi="Times New Roman"/>
+                <w:b w:val="false"/>
+                <w:bCs w:val="false"/>
+                <w:sz w:val="18"/>
+                <w:szCs w:val="18"/>
+              </w:rPr>
+              <w:t xml:space="preserve">0.434</w:t>
+            </w:r>
+          </w:p>
+        </w:tc>
+        <w:tc>
+          <w:tcPr>
+            <w:tcW w:type="dxa" w:w="1200"/>
+            <w:tcBorders>
+              <w:top w:val="single" w:color="999999" w:sz="4"/>
+              <w:left w:val="single" w:color="999999" w:sz="4"/>
+              <w:bottom w:val="single" w:color="999999" w:sz="4"/>
+              <w:right w:val="single" w:color="999999" w:sz="4"/>
+            </w:tcBorders>
+            <w:tcMar>
+              <w:top w:type="dxa" w:w="40"/>
+              <w:left w:type="dxa" w:w="80"/>
+              <w:bottom w:type="dxa" w:w="40"/>
+              <w:right w:type="dxa" w:w="80"/>
+            </w:tcMar>
+          </w:tcPr>
+          <w:p>
+            <w:pPr>
+              <w:jc w:val="center"/>
+            </w:pPr>
+            <w:r>
+              <w:rPr>
+                <w:rFonts w:ascii="Times New Roman" w:cs="Times New Roman" w:eastAsia="Times New Roman" w:hAnsi="Times New Roman"/>
+                <w:b w:val="false"/>
+                <w:bCs w:val="false"/>
+                <w:sz w:val="18"/>
+                <w:szCs w:val="18"/>
+              </w:rPr>
+              <w:t xml:space="preserve">0.436</w:t>
+            </w:r>
+          </w:p>
+        </w:tc>
+        <w:tc>
+          <w:tcPr>
+            <w:tcW w:type="dxa" w:w="1200"/>
+            <w:tcBorders>
+              <w:top w:val="single" w:color="999999" w:sz="4"/>
+              <w:left w:val="single" w:color="999999" w:sz="4"/>
+              <w:bottom w:val="single" w:color="999999" w:sz="4"/>
+              <w:right w:val="single" w:color="999999" w:sz="4"/>
+            </w:tcBorders>
+            <w:tcMar>
+              <w:top w:type="dxa" w:w="40"/>
+              <w:left w:type="dxa" w:w="80"/>
+              <w:bottom w:type="dxa" w:w="40"/>
+              <w:right w:type="dxa" w:w="80"/>
+            </w:tcMar>
+          </w:tcPr>
+          <w:p>
+            <w:pPr>
+              <w:jc w:val="center"/>
+            </w:pPr>
+            <w:r>
+              <w:rPr>
+                <w:rFonts w:ascii="Times New Roman" w:cs="Times New Roman" w:eastAsia="Times New Roman" w:hAnsi="Times New Roman"/>
+                <w:b w:val="false"/>
+                <w:bCs w:val="false"/>
+                <w:sz w:val="18"/>
+                <w:szCs w:val="18"/>
+              </w:rPr>
+              <w:t xml:space="preserve">0.441</w:t>
+            </w:r>
+          </w:p>
+        </w:tc>
+        <w:tc>
+          <w:tcPr>
+            <w:tcW w:type="dxa" w:w="1200"/>
+            <w:tcBorders>
+              <w:top w:val="single" w:color="999999" w:sz="4"/>
+              <w:left w:val="single" w:color="999999" w:sz="4"/>
+              <w:bottom w:val="single" w:color="999999" w:sz="4"/>
+              <w:right w:val="single" w:color="999999" w:sz="4"/>
+            </w:tcBorders>
+            <w:tcMar>
+              <w:top w:type="dxa" w:w="40"/>
+              <w:left w:type="dxa" w:w="80"/>
+              <w:bottom w:type="dxa" w:w="40"/>
+              <w:right w:type="dxa" w:w="80"/>
+            </w:tcMar>
+          </w:tcPr>
+          <w:p>
+            <w:pPr>
+              <w:jc w:val="center"/>
+            </w:pPr>
+            <w:r>
+              <w:rPr>
+                <w:rFonts w:ascii="Times New Roman" w:cs="Times New Roman" w:eastAsia="Times New Roman" w:hAnsi="Times New Roman"/>
+                <w:b w:val="false"/>
+                <w:bCs w:val="false"/>
+                <w:sz w:val="18"/>
+                <w:szCs w:val="18"/>
+              </w:rPr>
+              <w:t xml:space="preserve">0.451</w:t>
+            </w:r>
+          </w:p>
+        </w:tc>
+        <w:tc>
+          <w:tcPr>
+            <w:tcW w:type="dxa" w:w="1200"/>
+            <w:tcBorders>
+              <w:top w:val="single" w:color="999999" w:sz="4"/>
+              <w:left w:val="single" w:color="999999" w:sz="4"/>
+              <w:bottom w:val="single" w:color="999999" w:sz="4"/>
+              <w:right w:val="single" w:color="999999" w:sz="4"/>
+            </w:tcBorders>
+            <w:tcMar>
+              <w:top w:type="dxa" w:w="40"/>
+              <w:left w:type="dxa" w:w="80"/>
+              <w:bottom w:type="dxa" w:w="40"/>
+              <w:right w:type="dxa" w:w="80"/>
+            </w:tcMar>
+          </w:tcPr>
+          <w:p>
+            <w:pPr>
+              <w:jc w:val="center"/>
+            </w:pPr>
+            <w:r>
+              <w:rPr>
+                <w:rFonts w:ascii="Times New Roman" w:cs="Times New Roman" w:eastAsia="Times New Roman" w:hAnsi="Times New Roman"/>
+                <w:b w:val="false"/>
+                <w:bCs w:val="false"/>
+                <w:sz w:val="18"/>
+                <w:szCs w:val="18"/>
+              </w:rPr>
+              <w:t xml:space="preserve">0.453</w:t>
+            </w:r>
+          </w:p>
+        </w:tc>
+      </w:tr>
+      <w:tr>
+        <w:tc>
+          <w:tcPr>
+            <w:tcW w:type="dxa" w:w="2026"/>
+            <w:tcBorders>
+              <w:top w:val="single" w:color="999999" w:sz="4"/>
+              <w:left w:val="single" w:color="999999" w:sz="4"/>
+              <w:bottom w:val="single" w:color="999999" w:sz="4"/>
+              <w:right w:val="single" w:color="999999" w:sz="4"/>
+            </w:tcBorders>
+            <w:tcMar>
+              <w:top w:type="dxa" w:w="40"/>
+              <w:left w:type="dxa" w:w="80"/>
+              <w:bottom w:type="dxa" w:w="40"/>
+              <w:right w:type="dxa" w:w="80"/>
+            </w:tcMar>
+          </w:tcPr>
+          <w:p>
+            <w:pPr>
+              <w:jc w:val="left"/>
+            </w:pPr>
+            <w:r>
+              <w:rPr>
+                <w:rFonts w:ascii="Times New Roman" w:cs="Times New Roman" w:eastAsia="Times New Roman" w:hAnsi="Times New Roman"/>
+                <w:b w:val="false"/>
+                <w:bCs w:val="false"/>
+                <w:sz w:val="18"/>
+                <w:szCs w:val="18"/>
+              </w:rPr>
+              <w:t xml:space="preserve">SLUE-SQA-5 test</w:t>
+            </w:r>
+          </w:p>
+        </w:tc>
+        <w:tc>
+          <w:tcPr>
+            <w:tcW w:type="dxa" w:w="1100"/>
+            <w:tcBorders>
+              <w:top w:val="single" w:color="999999" w:sz="4"/>
+              <w:left w:val="single" w:color="999999" w:sz="4"/>
+              <w:bottom w:val="single" w:color="999999" w:sz="4"/>
+              <w:right w:val="single" w:color="999999" w:sz="4"/>
+            </w:tcBorders>
+            <w:tcMar>
+              <w:top w:type="dxa" w:w="40"/>
+              <w:left w:type="dxa" w:w="80"/>
+              <w:bottom w:type="dxa" w:w="40"/>
+              <w:right w:type="dxa" w:w="80"/>
+            </w:tcMar>
+          </w:tcPr>
+          <w:p>
+            <w:pPr>
+              <w:jc w:val="center"/>
+            </w:pPr>
+            <w:r>
+              <w:rPr>
+                <w:rFonts w:ascii="Times New Roman" w:cs="Times New Roman" w:eastAsia="Times New Roman" w:hAnsi="Times New Roman"/>
+                <w:b w:val="false"/>
+                <w:bCs w:val="false"/>
+                <w:sz w:val="18"/>
+                <w:szCs w:val="18"/>
+              </w:rPr>
+              <w:t xml:space="preserve">0.469</w:t>
+            </w:r>
+          </w:p>
+        </w:tc>
+        <w:tc>
+          <w:tcPr>
+            <w:tcW w:type="dxa" w:w="1100"/>
+            <w:tcBorders>
+              <w:top w:val="single" w:color="999999" w:sz="4"/>
+              <w:left w:val="single" w:color="999999" w:sz="4"/>
+              <w:bottom w:val="single" w:color="999999" w:sz="4"/>
+              <w:right w:val="single" w:color="999999" w:sz="4"/>
+            </w:tcBorders>
+            <w:tcMar>
+              <w:top w:type="dxa" w:w="40"/>
+              <w:left w:type="dxa" w:w="80"/>
+              <w:bottom w:type="dxa" w:w="40"/>
+              <w:right w:type="dxa" w:w="80"/>
+            </w:tcMar>
+          </w:tcPr>
+          <w:p>
+            <w:pPr>
+              <w:jc w:val="center"/>
+            </w:pPr>
+            <w:r>
+              <w:rPr>
+                <w:rFonts w:ascii="Times New Roman" w:cs="Times New Roman" w:eastAsia="Times New Roman" w:hAnsi="Times New Roman"/>
+                <w:b w:val="false"/>
+                <w:bCs w:val="false"/>
+                <w:sz w:val="18"/>
+                <w:szCs w:val="18"/>
+              </w:rPr>
+              <w:t xml:space="preserve">0.450</w:t>
+            </w:r>
+          </w:p>
+        </w:tc>
+        <w:tc>
+          <w:tcPr>
+            <w:tcW w:type="dxa" w:w="1200"/>
+            <w:tcBorders>
+              <w:top w:val="single" w:color="999999" w:sz="4"/>
+              <w:left w:val="single" w:color="999999" w:sz="4"/>
+              <w:bottom w:val="single" w:color="999999" w:sz="4"/>
+              <w:right w:val="single" w:color="999999" w:sz="4"/>
+            </w:tcBorders>
+            <w:tcMar>
+              <w:top w:type="dxa" w:w="40"/>
+              <w:left w:type="dxa" w:w="80"/>
+              <w:bottom w:type="dxa" w:w="40"/>
+              <w:right w:type="dxa" w:w="80"/>
+            </w:tcMar>
+          </w:tcPr>
+          <w:p>
+            <w:pPr>
+              <w:jc w:val="center"/>
+            </w:pPr>
+            <w:r>
+              <w:rPr>
+                <w:rFonts w:ascii="Times New Roman" w:cs="Times New Roman" w:eastAsia="Times New Roman" w:hAnsi="Times New Roman"/>
+                <w:b w:val="false"/>
+                <w:bCs w:val="false"/>
+                <w:sz w:val="18"/>
+                <w:szCs w:val="18"/>
+              </w:rPr>
+              <w:t xml:space="preserve">0.385‡</w:t>
+            </w:r>
+          </w:p>
+        </w:tc>
+        <w:tc>
+          <w:tcPr>
+            <w:tcW w:type="dxa" w:w="1200"/>
+            <w:tcBorders>
+              <w:top w:val="single" w:color="999999" w:sz="4"/>
+              <w:left w:val="single" w:color="999999" w:sz="4"/>
+              <w:bottom w:val="single" w:color="999999" w:sz="4"/>
+              <w:right w:val="single" w:color="999999" w:sz="4"/>
+            </w:tcBorders>
+            <w:tcMar>
+              <w:top w:type="dxa" w:w="40"/>
+              <w:left w:type="dxa" w:w="80"/>
+              <w:bottom w:type="dxa" w:w="40"/>
+              <w:right w:type="dxa" w:w="80"/>
+            </w:tcMar>
+          </w:tcPr>
+          <w:p>
+            <w:pPr>
+              <w:jc w:val="center"/>
+            </w:pPr>
+            <w:r>
+              <w:rPr>
+                <w:rFonts w:ascii="Times New Roman" w:cs="Times New Roman" w:eastAsia="Times New Roman" w:hAnsi="Times New Roman"/>
+                <w:b w:val="false"/>
+                <w:bCs w:val="false"/>
+                <w:sz w:val="18"/>
+                <w:szCs w:val="18"/>
+              </w:rPr>
+              <w:t xml:space="preserve">0.447</w:t>
+            </w:r>
+          </w:p>
+        </w:tc>
+        <w:tc>
+          <w:tcPr>
+            <w:tcW w:type="dxa" w:w="1200"/>
+            <w:tcBorders>
+              <w:top w:val="single" w:color="999999" w:sz="4"/>
+              <w:left w:val="single" w:color="999999" w:sz="4"/>
+              <w:bottom w:val="single" w:color="999999" w:sz="4"/>
+              <w:right w:val="single" w:color="999999" w:sz="4"/>
+            </w:tcBorders>
+            <w:tcMar>
+              <w:top w:type="dxa" w:w="40"/>
+              <w:left w:type="dxa" w:w="80"/>
+              <w:bottom w:type="dxa" w:w="40"/>
+              <w:right w:type="dxa" w:w="80"/>
+            </w:tcMar>
+          </w:tcPr>
+          <w:p>
+            <w:pPr>
+              <w:jc w:val="center"/>
+            </w:pPr>
+            <w:r>
+              <w:rPr>
+                <w:rFonts w:ascii="Times New Roman" w:cs="Times New Roman" w:eastAsia="Times New Roman" w:hAnsi="Times New Roman"/>
+                <w:b w:val="false"/>
+                <w:bCs w:val="false"/>
+                <w:sz w:val="18"/>
+                <w:szCs w:val="18"/>
+              </w:rPr>
+              <w:t xml:space="preserve">0.421‡</w:t>
+            </w:r>
+          </w:p>
+        </w:tc>
+        <w:tc>
+          <w:tcPr>
+            <w:tcW w:type="dxa" w:w="1200"/>
+            <w:tcBorders>
+              <w:top w:val="single" w:color="999999" w:sz="4"/>
+              <w:left w:val="single" w:color="999999" w:sz="4"/>
+              <w:bottom w:val="single" w:color="999999" w:sz="4"/>
+              <w:right w:val="single" w:color="999999" w:sz="4"/>
+            </w:tcBorders>
+            <w:tcMar>
+              <w:top w:type="dxa" w:w="40"/>
+              <w:left w:type="dxa" w:w="80"/>
+              <w:bottom w:type="dxa" w:w="40"/>
+              <w:right w:type="dxa" w:w="80"/>
+            </w:tcMar>
+          </w:tcPr>
+          <w:p>
+            <w:pPr>
+              <w:jc w:val="center"/>
+            </w:pPr>
+            <w:r>
+              <w:rPr>
+                <w:rFonts w:ascii="Times New Roman" w:cs="Times New Roman" w:eastAsia="Times New Roman" w:hAnsi="Times New Roman"/>
+                <w:b w:val="false"/>
+                <w:bCs w:val="false"/>
+                <w:sz w:val="18"/>
+                <w:szCs w:val="18"/>
+              </w:rPr>
+              <w:t xml:space="preserve">0.467</w:t>
+            </w:r>
+          </w:p>
+        </w:tc>
+      </w:tr>
+      <w:tr>
+        <w:tc>
+          <w:tcPr>
+            <w:tcW w:type="dxa" w:w="2026"/>
+            <w:tcBorders>
+              <w:top w:val="single" w:color="999999" w:sz="4"/>
+              <w:left w:val="single" w:color="999999" w:sz="4"/>
+              <w:bottom w:val="single" w:color="999999" w:sz="4"/>
+              <w:right w:val="single" w:color="999999" w:sz="4"/>
+            </w:tcBorders>
+            <w:tcMar>
+              <w:top w:type="dxa" w:w="40"/>
+              <w:left w:type="dxa" w:w="80"/>
+              <w:bottom w:type="dxa" w:w="40"/>
+              <w:right w:type="dxa" w:w="80"/>
+            </w:tcMar>
+          </w:tcPr>
+          <w:p>
+            <w:pPr>
+              <w:jc w:val="left"/>
+            </w:pPr>
+            <w:r>
+              <w:rPr>
+                <w:rFonts w:ascii="Times New Roman" w:cs="Times New Roman" w:eastAsia="Times New Roman" w:hAnsi="Times New Roman"/>
+                <w:b w:val="false"/>
+                <w:bCs w:val="false"/>
+                <w:sz w:val="18"/>
+                <w:szCs w:val="18"/>
+              </w:rPr>
+              <w:t xml:space="preserve">HeySQuAD dev (in-domain)</w:t>
+            </w:r>
+          </w:p>
+        </w:tc>
+        <w:tc>
+          <w:tcPr>
+            <w:tcW w:type="dxa" w:w="1100"/>
+            <w:tcBorders>
+              <w:top w:val="single" w:color="999999" w:sz="4"/>
+              <w:left w:val="single" w:color="999999" w:sz="4"/>
+              <w:bottom w:val="single" w:color="999999" w:sz="4"/>
+              <w:right w:val="single" w:color="999999" w:sz="4"/>
+            </w:tcBorders>
+            <w:tcMar>
+              <w:top w:type="dxa" w:w="40"/>
+              <w:left w:type="dxa" w:w="80"/>
+              <w:bottom w:type="dxa" w:w="40"/>
+              <w:right w:type="dxa" w:w="80"/>
+            </w:tcMar>
+          </w:tcPr>
+          <w:p>
+            <w:pPr>
+              <w:jc w:val="center"/>
+            </w:pPr>
+            <w:r>
+              <w:rPr>
+                <w:rFonts w:ascii="Times New Roman" w:cs="Times New Roman" w:eastAsia="Times New Roman" w:hAnsi="Times New Roman"/>
+                <w:b w:val="false"/>
+                <w:bCs w:val="false"/>
+                <w:sz w:val="18"/>
+                <w:szCs w:val="18"/>
+              </w:rPr>
+              <w:t xml:space="preserve">0.896</w:t>
+            </w:r>
+          </w:p>
+        </w:tc>
+        <w:tc>
+          <w:tcPr>
+            <w:tcW w:type="dxa" w:w="1100"/>
+            <w:tcBorders>
+              <w:top w:val="single" w:color="999999" w:sz="4"/>
+              <w:left w:val="single" w:color="999999" w:sz="4"/>
+              <w:bottom w:val="single" w:color="999999" w:sz="4"/>
+              <w:right w:val="single" w:color="999999" w:sz="4"/>
+            </w:tcBorders>
+            <w:tcMar>
+              <w:top w:type="dxa" w:w="40"/>
+              <w:left w:type="dxa" w:w="80"/>
+              <w:bottom w:type="dxa" w:w="40"/>
+              <w:right w:type="dxa" w:w="80"/>
+            </w:tcMar>
+          </w:tcPr>
+          <w:p>
+            <w:pPr>
+              <w:jc w:val="center"/>
+            </w:pPr>
+            <w:r>
+              <w:rPr>
+                <w:rFonts w:ascii="Times New Roman" w:cs="Times New Roman" w:eastAsia="Times New Roman" w:hAnsi="Times New Roman"/>
+                <w:b w:val="false"/>
+                <w:bCs w:val="false"/>
+                <w:sz w:val="18"/>
+                <w:szCs w:val="18"/>
+              </w:rPr>
+              <w:t xml:space="preserve">0.906</w:t>
+            </w:r>
+          </w:p>
+        </w:tc>
+        <w:tc>
+          <w:tcPr>
+            <w:tcW w:type="dxa" w:w="1200"/>
+            <w:tcBorders>
+              <w:top w:val="single" w:color="999999" w:sz="4"/>
+              <w:left w:val="single" w:color="999999" w:sz="4"/>
+              <w:bottom w:val="single" w:color="999999" w:sz="4"/>
+              <w:right w:val="single" w:color="999999" w:sz="4"/>
+            </w:tcBorders>
+            <w:tcMar>
+              <w:top w:type="dxa" w:w="40"/>
+              <w:left w:type="dxa" w:w="80"/>
+              <w:bottom w:type="dxa" w:w="40"/>
+              <w:right w:type="dxa" w:w="80"/>
+            </w:tcMar>
+          </w:tcPr>
+          <w:p>
+            <w:pPr>
+              <w:jc w:val="center"/>
+            </w:pPr>
+            <w:r>
+              <w:rPr>
+                <w:rFonts w:ascii="Times New Roman" w:cs="Times New Roman" w:eastAsia="Times New Roman" w:hAnsi="Times New Roman"/>
+                <w:b w:val="false"/>
+                <w:bCs w:val="false"/>
+                <w:sz w:val="18"/>
+                <w:szCs w:val="18"/>
+              </w:rPr>
+              <w:t xml:space="preserve">0.904</w:t>
+            </w:r>
+          </w:p>
+        </w:tc>
+        <w:tc>
+          <w:tcPr>
+            <w:tcW w:type="dxa" w:w="1200"/>
+            <w:tcBorders>
+              <w:top w:val="single" w:color="999999" w:sz="4"/>
+              <w:left w:val="single" w:color="999999" w:sz="4"/>
+              <w:bottom w:val="single" w:color="999999" w:sz="4"/>
+              <w:right w:val="single" w:color="999999" w:sz="4"/>
+            </w:tcBorders>
+            <w:tcMar>
+              <w:top w:type="dxa" w:w="40"/>
+              <w:left w:type="dxa" w:w="80"/>
+              <w:bottom w:type="dxa" w:w="40"/>
+              <w:right w:type="dxa" w:w="80"/>
+            </w:tcMar>
+          </w:tcPr>
+          <w:p>
+            <w:pPr>
+              <w:jc w:val="center"/>
+            </w:pPr>
+            <w:r>
+              <w:rPr>
+                <w:rFonts w:ascii="Times New Roman" w:cs="Times New Roman" w:eastAsia="Times New Roman" w:hAnsi="Times New Roman"/>
+                <w:b w:val="false"/>
+                <w:bCs w:val="false"/>
+                <w:sz w:val="18"/>
+                <w:szCs w:val="18"/>
+              </w:rPr>
+              <w:t xml:space="preserve">0.908</w:t>
+            </w:r>
+          </w:p>
+        </w:tc>
+        <w:tc>
+          <w:tcPr>
+            <w:tcW w:type="dxa" w:w="1200"/>
+            <w:tcBorders>
+              <w:top w:val="single" w:color="999999" w:sz="4"/>
+              <w:left w:val="single" w:color="999999" w:sz="4"/>
+              <w:bottom w:val="single" w:color="999999" w:sz="4"/>
+              <w:right w:val="single" w:color="999999" w:sz="4"/>
+            </w:tcBorders>
+            <w:tcMar>
+              <w:top w:type="dxa" w:w="40"/>
+              <w:left w:type="dxa" w:w="80"/>
+              <w:bottom w:type="dxa" w:w="40"/>
+              <w:right w:type="dxa" w:w="80"/>
+            </w:tcMar>
+          </w:tcPr>
+          <w:p>
+            <w:pPr>
+              <w:jc w:val="center"/>
+            </w:pPr>
+            <w:r>
+              <w:rPr>
+                <w:rFonts w:ascii="Times New Roman" w:cs="Times New Roman" w:eastAsia="Times New Roman" w:hAnsi="Times New Roman"/>
+                <w:b w:val="false"/>
+                <w:bCs w:val="false"/>
+                <w:sz w:val="18"/>
+                <w:szCs w:val="18"/>
+              </w:rPr>
+              <w:t xml:space="preserve">0.902</w:t>
+            </w:r>
+          </w:p>
+        </w:tc>
+        <w:tc>
+          <w:tcPr>
+            <w:tcW w:type="dxa" w:w="1200"/>
+            <w:tcBorders>
+              <w:top w:val="single" w:color="999999" w:sz="4"/>
+              <w:left w:val="single" w:color="999999" w:sz="4"/>
+              <w:bottom w:val="single" w:color="999999" w:sz="4"/>
+              <w:right w:val="single" w:color="999999" w:sz="4"/>
+            </w:tcBorders>
+            <w:tcMar>
+              <w:top w:type="dxa" w:w="40"/>
+              <w:left w:type="dxa" w:w="80"/>
+              <w:bottom w:type="dxa" w:w="40"/>
+              <w:right w:type="dxa" w:w="80"/>
+            </w:tcMar>
+          </w:tcPr>
+          <w:p>
+            <w:pPr>
+              <w:jc w:val="center"/>
+            </w:pPr>
+            <w:r>
+              <w:rPr>
+                <w:rFonts w:ascii="Times New Roman" w:cs="Times New Roman" w:eastAsia="Times New Roman" w:hAnsi="Times New Roman"/>
+                <w:b w:val="false"/>
+                <w:bCs w:val="false"/>
+                <w:sz w:val="18"/>
+                <w:szCs w:val="18"/>
+              </w:rPr>
+              <w:t xml:space="preserve">0.904</w:t>
+            </w:r>
+          </w:p>
+        </w:tc>
+      </w:tr>
+    </w:tbl>
+    <w:p>
+      <w:pPr>
+        <w:spacing w:after="120" w:before="0" w:line="276"/>
+        <w:jc w:val="center"/>
+      </w:pPr>
+      <w:r>
+        <w:rPr>
+          <w:rFonts w:ascii="Times New Roman" w:cs="Times New Roman" w:eastAsia="Times New Roman" w:hAnsi="Times New Roman"/>
+          <w:sz w:val="22"/>
+          <w:szCs w:val="22"/>
+        </w:rPr>
+        <w:t xml:space="preserve">‡ significantly worse than the synthetic counterpart (p &lt; 0.001 after Holm). No comparison favoured real-speech training.</w:t>
+      </w:r>
+    </w:p>
+    <w:p>
+      <w:pPr>
+        <w:keepNext/>
+        <w:spacing w:before="120"/>
+        <w:jc w:val="center"/>
+      </w:pPr>
+      <w:r>
+        <w:drawing>
+          <wp:inline distT="0" distB="0" distL="0" distR="0">
+            <wp:extent cx="5715000" cy="2152650"/>
+            <wp:effectExtent t="0" r="0" b="0" l="0"/>
+            <wp:docPr id="9" name=""/>
+            <wp:cNvGraphicFramePr>
+              <a:graphicFrameLocks xmlns:a="http://schemas.openxmlformats.org/drawingml/2006/main" noChangeAspect="1"/>
+            </wp:cNvGraphicFramePr>
+            <a:graphic xmlns:a="http://schemas.openxmlformats.org/drawingml/2006/main">
+              <a:graphicData uri="http://schemas.openxmlformats.org/drawingml/2006/picture">
+                <pic:pic xmlns:pic="http://schemas.openxmlformats.org/drawingml/2006/picture">
+                  <pic:nvPicPr>
+                    <pic:cNvPr id="0" name="" descr=""/>
+                    <pic:cNvPicPr>
+                      <a:picLocks noChangeAspect="1" noChangeArrowheads="1"/>
+                    </pic:cNvPicPr>
+                  </pic:nvPicPr>
+                  <pic:blipFill>
+                    <a:blip r:embed="rId16" cstate="none"/>
+                    <a:srcRect/>
+                    <a:stretch>
+                      <a:fillRect/>
+                    </a:stretch>
+                  </pic:blipFill>
+                  <pic:spPr bwMode="auto">
+                    <a:xfrm>
+                      <a:off x="0" y="0"/>
+                      <a:ext cx="5715000" cy="2152650"/>
+                    </a:xfrm>
+                    <a:prstGeom prst="rect">
+                      <a:avLst/>
+                    </a:prstGeom>
+                  </pic:spPr>
+                </pic:pic>
+              </a:graphicData>
+            </a:graphic>
+          </wp:inline>
+        </w:drawing>
+      </w:r>
+    </w:p>
+    <w:p>
+      <w:pPr>
+        <w:spacing w:after="200" w:before="60"/>
+        <w:jc w:val="center"/>
+      </w:pPr>
+      <w:r>
+        <w:rPr>
+          <w:rFonts w:ascii="Times New Roman" w:cs="Times New Roman" w:eastAsia="Times New Roman" w:hAnsi="Times New Roman"/>
+          <w:i/>
+          <w:iCs/>
+          <w:sz w:val="19"/>
+          <w:szCs w:val="19"/>
+        </w:rPr>
+        <w:t xml:space="preserve">Fig. 9. Training on real vs. synthetic speech errors (HeySQuAD-trained MiniLM).</w:t>
+      </w:r>
+    </w:p>
+    <w:p>
+      <w:pPr>
+        <w:spacing w:after="120" w:before="0" w:line="276"/>
+        <w:jc w:val="both"/>
+      </w:pPr>
+      <w:r>
+        <w:rPr>
+          <w:rFonts w:ascii="Times New Roman" w:cs="Times New Roman" w:eastAsia="Times New Roman" w:hAnsi="Times New Roman"/>
+          <w:b/>
+          <w:bCs/>
+          <w:sz w:val="22"/>
+          <w:szCs w:val="22"/>
+        </w:rPr>
+        <w:t xml:space="preserve">Stronger distillation (C6, confirmed). </w:t>
+      </w:r>
+      <w:r>
+        <w:rPr>
+          <w:rFonts w:ascii="Times New Roman" w:cs="Times New Roman" w:eastAsia="Times New Roman" w:hAnsi="Times New Roman"/>
+          <w:sz w:val="22"/>
+          <w:szCs w:val="22"/>
+        </w:rPr>
+        <w:t xml:space="preserve">On validation only, we compared a 568M-parameter teacher (bge-reranker-v2-m3) with BM25 or hybrid candidates and temperatures 1, 2 and 4, and the best of these trained on BEIR plus HeySQuAD. The selected configuration (bge-reranker-v2-m3 teacher, hybrid candidates, τ = 4, BEIR training data) was retrained with three seeds and tested once. The 22.7M MiniLM student now significantly beats its zero-shot self on all three pre-registered test groups (Table XIV): this is the first significant improvement over zero-shot for the small model in the whole study.</w:t>
+      </w:r>
+    </w:p>
+    <w:p>
+      <w:pPr>
+        <w:keepNext/>
+        <w:spacing w:after="80" w:before="160"/>
+        <w:jc w:val="center"/>
+      </w:pPr>
+      <w:r>
+        <w:rPr>
+          <w:rFonts w:ascii="Times New Roman" w:cs="Times New Roman" w:eastAsia="Times New Roman" w:hAnsi="Times New Roman"/>
+          <w:b/>
+          <w:bCs/>
+          <w:sz w:val="19"/>
+          <w:szCs w:val="19"/>
+        </w:rPr>
+        <w:t xml:space="preserve">TABLE XIV. C6: selected distillation configuration vs. zero-shot ce-l6 (nDCG@10, mean of 3 seeds; Holm over 3 tests)</w:t>
+      </w:r>
+    </w:p>
+    <w:tbl>
+      <w:tblPr>
+        <w:tblW w:type="dxa" w:w="9026"/>
+        <w:jc w:val="center"/>
+        <w:tblBorders>
+          <w:top w:val="single" w:color="auto" w:sz="4"/>
+          <w:left w:val="single" w:color="auto" w:sz="4"/>
+          <w:bottom w:val="single" w:color="auto" w:sz="4"/>
+          <w:right w:val="single" w:color="auto" w:sz="4"/>
+          <w:insideH w:val="single" w:color="auto" w:sz="4"/>
+          <w:insideV w:val="single" w:color="auto" w:sz="4"/>
+        </w:tblBorders>
+      </w:tblPr>
+      <w:tblGrid>
+        <w:gridCol w:w="3226"/>
+        <w:gridCol w:w="1600"/>
+        <w:gridCol w:w="1600"/>
+        <w:gridCol w:w="1100"/>
+        <w:gridCol w:w="1500"/>
+      </w:tblGrid>
+      <w:tr>
+        <w:trPr>
+          <w:tblHeader/>
+        </w:trPr>
+        <w:tc>
+          <w:tcPr>
+            <w:tcW w:type="dxa" w:w="3226"/>
+            <w:tcBorders>
+              <w:top w:val="single" w:color="999999" w:sz="4"/>
+              <w:left w:val="single" w:color="999999" w:sz="4"/>
+              <w:bottom w:val="single" w:color="999999" w:sz="4"/>
+              <w:right w:val="single" w:color="999999" w:sz="4"/>
+            </w:tcBorders>
+            <w:shd w:fill="E8EEF4" w:color="auto" w:val="clear"/>
+            <w:tcMar>
+              <w:top w:type="dxa" w:w="40"/>
+              <w:left w:type="dxa" w:w="80"/>
+              <w:bottom w:type="dxa" w:w="40"/>
+              <w:right w:type="dxa" w:w="80"/>
+            </w:tcMar>
+          </w:tcPr>
+          <w:p>
+            <w:pPr>
+              <w:jc w:val="left"/>
+            </w:pPr>
+            <w:r>
+              <w:rPr>
+                <w:rFonts w:ascii="Times New Roman" w:cs="Times New Roman" w:eastAsia="Times New Roman" w:hAnsi="Times New Roman"/>
+                <w:b/>
+                <w:bCs/>
+                <w:sz w:val="18"/>
+                <w:szCs w:val="18"/>
+              </w:rPr>
+              <w:t xml:space="preserve">Test set</w:t>
+            </w:r>
+          </w:p>
+        </w:tc>
+        <w:tc>
+          <w:tcPr>
+            <w:tcW w:type="dxa" w:w="1600"/>
+            <w:tcBorders>
+              <w:top w:val="single" w:color="999999" w:sz="4"/>
+              <w:left w:val="single" w:color="999999" w:sz="4"/>
+              <w:bottom w:val="single" w:color="999999" w:sz="4"/>
+              <w:right w:val="single" w:color="999999" w:sz="4"/>
+            </w:tcBorders>
+            <w:shd w:fill="E8EEF4" w:color="auto" w:val="clear"/>
+            <w:tcMar>
+              <w:top w:type="dxa" w:w="40"/>
+              <w:left w:type="dxa" w:w="80"/>
+              <w:bottom w:type="dxa" w:w="40"/>
+              <w:right w:type="dxa" w:w="80"/>
+            </w:tcMar>
+          </w:tcPr>
+          <w:p>
+            <w:pPr>
+              <w:jc w:val="center"/>
+            </w:pPr>
+            <w:r>
+              <w:rPr>
+                <w:rFonts w:ascii="Times New Roman" w:cs="Times New Roman" w:eastAsia="Times New Roman" w:hAnsi="Times New Roman"/>
+                <w:b/>
+                <w:bCs/>
+                <w:sz w:val="18"/>
+                <w:szCs w:val="18"/>
+              </w:rPr>
+              <w:t xml:space="preserve">Zero-shot ce-l6</w:t>
+            </w:r>
+          </w:p>
+        </w:tc>
+        <w:tc>
+          <w:tcPr>
+            <w:tcW w:type="dxa" w:w="1600"/>
+            <w:tcBorders>
+              <w:top w:val="single" w:color="999999" w:sz="4"/>
+              <w:left w:val="single" w:color="999999" w:sz="4"/>
+              <w:bottom w:val="single" w:color="999999" w:sz="4"/>
+              <w:right w:val="single" w:color="999999" w:sz="4"/>
+            </w:tcBorders>
+            <w:shd w:fill="E8EEF4" w:color="auto" w:val="clear"/>
+            <w:tcMar>
+              <w:top w:type="dxa" w:w="40"/>
+              <w:left w:type="dxa" w:w="80"/>
+              <w:bottom w:type="dxa" w:w="40"/>
+              <w:right w:type="dxa" w:w="80"/>
+            </w:tcMar>
+          </w:tcPr>
+          <w:p>
+            <w:pPr>
+              <w:jc w:val="center"/>
+            </w:pPr>
+            <w:r>
+              <w:rPr>
+                <w:rFonts w:ascii="Times New Roman" w:cs="Times New Roman" w:eastAsia="Times New Roman" w:hAnsi="Times New Roman"/>
+                <w:b/>
+                <w:bCs/>
+                <w:sz w:val="18"/>
+                <w:szCs w:val="18"/>
+              </w:rPr>
+              <w:t xml:space="preserve">Distilled ce-l6</w:t>
+            </w:r>
+          </w:p>
+        </w:tc>
+        <w:tc>
+          <w:tcPr>
+            <w:tcW w:type="dxa" w:w="1100"/>
+            <w:tcBorders>
+              <w:top w:val="single" w:color="999999" w:sz="4"/>
+              <w:left w:val="single" w:color="999999" w:sz="4"/>
+              <w:bottom w:val="single" w:color="999999" w:sz="4"/>
+              <w:right w:val="single" w:color="999999" w:sz="4"/>
+            </w:tcBorders>
+            <w:shd w:fill="E8EEF4" w:color="auto" w:val="clear"/>
+            <w:tcMar>
+              <w:top w:type="dxa" w:w="40"/>
+              <w:left w:type="dxa" w:w="80"/>
+              <w:bottom w:type="dxa" w:w="40"/>
+              <w:right w:type="dxa" w:w="80"/>
+            </w:tcMar>
+          </w:tcPr>
+          <w:p>
+            <w:pPr>
+              <w:jc w:val="center"/>
+            </w:pPr>
+            <w:r>
+              <w:rPr>
+                <w:rFonts w:ascii="Times New Roman" w:cs="Times New Roman" w:eastAsia="Times New Roman" w:hAnsi="Times New Roman"/>
+                <w:b/>
+                <w:bCs/>
+                <w:sz w:val="18"/>
+                <w:szCs w:val="18"/>
+              </w:rPr>
+              <w:t xml:space="preserve">Δ</w:t>
+            </w:r>
+          </w:p>
+        </w:tc>
+        <w:tc>
+          <w:tcPr>
+            <w:tcW w:type="dxa" w:w="1500"/>
+            <w:tcBorders>
+              <w:top w:val="single" w:color="999999" w:sz="4"/>
+              <w:left w:val="single" w:color="999999" w:sz="4"/>
+              <w:bottom w:val="single" w:color="999999" w:sz="4"/>
+              <w:right w:val="single" w:color="999999" w:sz="4"/>
+            </w:tcBorders>
+            <w:shd w:fill="E8EEF4" w:color="auto" w:val="clear"/>
+            <w:tcMar>
+              <w:top w:type="dxa" w:w="40"/>
+              <w:left w:type="dxa" w:w="80"/>
+              <w:bottom w:type="dxa" w:w="40"/>
+              <w:right w:type="dxa" w:w="80"/>
+            </w:tcMar>
+          </w:tcPr>
+          <w:p>
+            <w:pPr>
+              <w:jc w:val="center"/>
+            </w:pPr>
+            <w:r>
+              <w:rPr>
+                <w:rFonts w:ascii="Times New Roman" w:cs="Times New Roman" w:eastAsia="Times New Roman" w:hAnsi="Times New Roman"/>
+                <w:b/>
+                <w:bCs/>
+                <w:sz w:val="18"/>
+                <w:szCs w:val="18"/>
+              </w:rPr>
+              <w:t xml:space="preserve">p (Holm)</w:t>
+            </w:r>
+          </w:p>
+        </w:tc>
+      </w:tr>
+      <w:tr>
+        <w:tc>
+          <w:tcPr>
+            <w:tcW w:type="dxa" w:w="3226"/>
+            <w:tcBorders>
+              <w:top w:val="single" w:color="999999" w:sz="4"/>
+              <w:left w:val="single" w:color="999999" w:sz="4"/>
+              <w:bottom w:val="single" w:color="999999" w:sz="4"/>
+              <w:right w:val="single" w:color="999999" w:sz="4"/>
+            </w:tcBorders>
+            <w:tcMar>
+              <w:top w:type="dxa" w:w="40"/>
+              <w:left w:type="dxa" w:w="80"/>
+              <w:bottom w:type="dxa" w:w="40"/>
+              <w:right w:type="dxa" w:w="80"/>
+            </w:tcMar>
+          </w:tcPr>
+          <w:p>
+            <w:pPr>
+              <w:jc w:val="left"/>
+            </w:pPr>
+            <w:r>
+              <w:rPr>
+                <w:rFonts w:ascii="Times New Roman" w:cs="Times New Roman" w:eastAsia="Times New Roman" w:hAnsi="Times New Roman"/>
+                <w:b w:val="false"/>
+                <w:bCs w:val="false"/>
+                <w:sz w:val="18"/>
+                <w:szCs w:val="18"/>
+              </w:rPr>
+              <w:t xml:space="preserve">BEIR spoken (3 datasets × 2 channels)</w:t>
+            </w:r>
+          </w:p>
+        </w:tc>
+        <w:tc>
+          <w:tcPr>
+            <w:tcW w:type="dxa" w:w="1600"/>
+            <w:tcBorders>
+              <w:top w:val="single" w:color="999999" w:sz="4"/>
+              <w:left w:val="single" w:color="999999" w:sz="4"/>
+              <w:bottom w:val="single" w:color="999999" w:sz="4"/>
+              <w:right w:val="single" w:color="999999" w:sz="4"/>
+            </w:tcBorders>
+            <w:tcMar>
+              <w:top w:type="dxa" w:w="40"/>
+              <w:left w:type="dxa" w:w="80"/>
+              <w:bottom w:type="dxa" w:w="40"/>
+              <w:right w:type="dxa" w:w="80"/>
+            </w:tcMar>
+          </w:tcPr>
+          <w:p>
+            <w:pPr>
+              <w:jc w:val="center"/>
+            </w:pPr>
+            <w:r>
+              <w:rPr>
+                <w:rFonts w:ascii="Times New Roman" w:cs="Times New Roman" w:eastAsia="Times New Roman" w:hAnsi="Times New Roman"/>
+                <w:b w:val="false"/>
+                <w:bCs w:val="false"/>
+                <w:sz w:val="18"/>
+                <w:szCs w:val="18"/>
+              </w:rPr>
+              <w:t xml:space="preserve">0.313</w:t>
+            </w:r>
+          </w:p>
+        </w:tc>
+        <w:tc>
+          <w:tcPr>
+            <w:tcW w:type="dxa" w:w="1600"/>
+            <w:tcBorders>
+              <w:top w:val="single" w:color="999999" w:sz="4"/>
+              <w:left w:val="single" w:color="999999" w:sz="4"/>
+              <w:bottom w:val="single" w:color="999999" w:sz="4"/>
+              <w:right w:val="single" w:color="999999" w:sz="4"/>
+            </w:tcBorders>
+            <w:tcMar>
+              <w:top w:type="dxa" w:w="40"/>
+              <w:left w:type="dxa" w:w="80"/>
+              <w:bottom w:type="dxa" w:w="40"/>
+              <w:right w:type="dxa" w:w="80"/>
+            </w:tcMar>
+          </w:tcPr>
+          <w:p>
+            <w:pPr>
+              <w:jc w:val="center"/>
+            </w:pPr>
+            <w:r>
+              <w:rPr>
+                <w:rFonts w:ascii="Times New Roman" w:cs="Times New Roman" w:eastAsia="Times New Roman" w:hAnsi="Times New Roman"/>
+                <w:b w:val="false"/>
+                <w:bCs w:val="false"/>
+                <w:sz w:val="18"/>
+                <w:szCs w:val="18"/>
+              </w:rPr>
+              <w:t xml:space="preserve">0.321</w:t>
+            </w:r>
+          </w:p>
+        </w:tc>
+        <w:tc>
+          <w:tcPr>
+            <w:tcW w:type="dxa" w:w="1100"/>
+            <w:tcBorders>
+              <w:top w:val="single" w:color="999999" w:sz="4"/>
+              <w:left w:val="single" w:color="999999" w:sz="4"/>
+              <w:bottom w:val="single" w:color="999999" w:sz="4"/>
+              <w:right w:val="single" w:color="999999" w:sz="4"/>
+            </w:tcBorders>
+            <w:tcMar>
+              <w:top w:type="dxa" w:w="40"/>
+              <w:left w:type="dxa" w:w="80"/>
+              <w:bottom w:type="dxa" w:w="40"/>
+              <w:right w:type="dxa" w:w="80"/>
+            </w:tcMar>
+          </w:tcPr>
+          <w:p>
+            <w:pPr>
+              <w:jc w:val="center"/>
+            </w:pPr>
+            <w:r>
+              <w:rPr>
+                <w:rFonts w:ascii="Times New Roman" w:cs="Times New Roman" w:eastAsia="Times New Roman" w:hAnsi="Times New Roman"/>
+                <w:b w:val="false"/>
+                <w:bCs w:val="false"/>
+                <w:sz w:val="18"/>
+                <w:szCs w:val="18"/>
+              </w:rPr>
+              <w:t xml:space="preserve">+0.008</w:t>
+            </w:r>
+          </w:p>
+        </w:tc>
+        <w:tc>
+          <w:tcPr>
+            <w:tcW w:type="dxa" w:w="1500"/>
+            <w:tcBorders>
+              <w:top w:val="single" w:color="999999" w:sz="4"/>
+              <w:left w:val="single" w:color="999999" w:sz="4"/>
+              <w:bottom w:val="single" w:color="999999" w:sz="4"/>
+              <w:right w:val="single" w:color="999999" w:sz="4"/>
+            </w:tcBorders>
+            <w:tcMar>
+              <w:top w:type="dxa" w:w="40"/>
+              <w:left w:type="dxa" w:w="80"/>
+              <w:bottom w:type="dxa" w:w="40"/>
+              <w:right w:type="dxa" w:w="80"/>
+            </w:tcMar>
+          </w:tcPr>
+          <w:p>
+            <w:pPr>
+              <w:jc w:val="center"/>
+            </w:pPr>
+            <w:r>
+              <w:rPr>
+                <w:rFonts w:ascii="Times New Roman" w:cs="Times New Roman" w:eastAsia="Times New Roman" w:hAnsi="Times New Roman"/>
+                <w:b w:val="false"/>
+                <w:bCs w:val="false"/>
+                <w:sz w:val="18"/>
+                <w:szCs w:val="18"/>
+              </w:rPr>
+              <w:t xml:space="preserve">&lt;0.001</w:t>
+            </w:r>
+          </w:p>
+        </w:tc>
+      </w:tr>
+      <w:tr>
+        <w:tc>
+          <w:tcPr>
+            <w:tcW w:type="dxa" w:w="3226"/>
+            <w:tcBorders>
+              <w:top w:val="single" w:color="999999" w:sz="4"/>
+              <w:left w:val="single" w:color="999999" w:sz="4"/>
+              <w:bottom w:val="single" w:color="999999" w:sz="4"/>
+              <w:right w:val="single" w:color="999999" w:sz="4"/>
+            </w:tcBorders>
+            <w:tcMar>
+              <w:top w:type="dxa" w:w="40"/>
+              <w:left w:type="dxa" w:w="80"/>
+              <w:bottom w:type="dxa" w:w="40"/>
+              <w:right w:type="dxa" w:w="80"/>
+            </w:tcMar>
+          </w:tcPr>
+          <w:p>
+            <w:pPr>
+              <w:jc w:val="left"/>
+            </w:pPr>
+            <w:r>
+              <w:rPr>
+                <w:rFonts w:ascii="Times New Roman" w:cs="Times New Roman" w:eastAsia="Times New Roman" w:hAnsi="Times New Roman"/>
+                <w:b w:val="false"/>
+                <w:bCs w:val="false"/>
+                <w:sz w:val="18"/>
+                <w:szCs w:val="18"/>
+              </w:rPr>
+              <w:t xml:space="preserve">SD-QA-Whisper</w:t>
+            </w:r>
+          </w:p>
+        </w:tc>
+        <w:tc>
+          <w:tcPr>
+            <w:tcW w:type="dxa" w:w="1600"/>
+            <w:tcBorders>
+              <w:top w:val="single" w:color="999999" w:sz="4"/>
+              <w:left w:val="single" w:color="999999" w:sz="4"/>
+              <w:bottom w:val="single" w:color="999999" w:sz="4"/>
+              <w:right w:val="single" w:color="999999" w:sz="4"/>
+            </w:tcBorders>
+            <w:tcMar>
+              <w:top w:type="dxa" w:w="40"/>
+              <w:left w:type="dxa" w:w="80"/>
+              <w:bottom w:type="dxa" w:w="40"/>
+              <w:right w:type="dxa" w:w="80"/>
+            </w:tcMar>
+          </w:tcPr>
+          <w:p>
+            <w:pPr>
+              <w:jc w:val="center"/>
+            </w:pPr>
+            <w:r>
+              <w:rPr>
+                <w:rFonts w:ascii="Times New Roman" w:cs="Times New Roman" w:eastAsia="Times New Roman" w:hAnsi="Times New Roman"/>
+                <w:b w:val="false"/>
+                <w:bCs w:val="false"/>
+                <w:sz w:val="18"/>
+                <w:szCs w:val="18"/>
+              </w:rPr>
+              <w:t xml:space="preserve">0.469</w:t>
+            </w:r>
+          </w:p>
+        </w:tc>
+        <w:tc>
+          <w:tcPr>
+            <w:tcW w:type="dxa" w:w="1600"/>
+            <w:tcBorders>
+              <w:top w:val="single" w:color="999999" w:sz="4"/>
+              <w:left w:val="single" w:color="999999" w:sz="4"/>
+              <w:bottom w:val="single" w:color="999999" w:sz="4"/>
+              <w:right w:val="single" w:color="999999" w:sz="4"/>
+            </w:tcBorders>
+            <w:tcMar>
+              <w:top w:type="dxa" w:w="40"/>
+              <w:left w:type="dxa" w:w="80"/>
+              <w:bottom w:type="dxa" w:w="40"/>
+              <w:right w:type="dxa" w:w="80"/>
+            </w:tcMar>
+          </w:tcPr>
+          <w:p>
+            <w:pPr>
+              <w:jc w:val="center"/>
+            </w:pPr>
+            <w:r>
+              <w:rPr>
+                <w:rFonts w:ascii="Times New Roman" w:cs="Times New Roman" w:eastAsia="Times New Roman" w:hAnsi="Times New Roman"/>
+                <w:b w:val="false"/>
+                <w:bCs w:val="false"/>
+                <w:sz w:val="18"/>
+                <w:szCs w:val="18"/>
+              </w:rPr>
+              <w:t xml:space="preserve">0.476</w:t>
+            </w:r>
+          </w:p>
+        </w:tc>
+        <w:tc>
+          <w:tcPr>
+            <w:tcW w:type="dxa" w:w="1100"/>
+            <w:tcBorders>
+              <w:top w:val="single" w:color="999999" w:sz="4"/>
+              <w:left w:val="single" w:color="999999" w:sz="4"/>
+              <w:bottom w:val="single" w:color="999999" w:sz="4"/>
+              <w:right w:val="single" w:color="999999" w:sz="4"/>
+            </w:tcBorders>
+            <w:tcMar>
+              <w:top w:type="dxa" w:w="40"/>
+              <w:left w:type="dxa" w:w="80"/>
+              <w:bottom w:type="dxa" w:w="40"/>
+              <w:right w:type="dxa" w:w="80"/>
+            </w:tcMar>
+          </w:tcPr>
+          <w:p>
+            <w:pPr>
+              <w:jc w:val="center"/>
+            </w:pPr>
+            <w:r>
+              <w:rPr>
+                <w:rFonts w:ascii="Times New Roman" w:cs="Times New Roman" w:eastAsia="Times New Roman" w:hAnsi="Times New Roman"/>
+                <w:b w:val="false"/>
+                <w:bCs w:val="false"/>
+                <w:sz w:val="18"/>
+                <w:szCs w:val="18"/>
+              </w:rPr>
+              <w:t xml:space="preserve">+0.007</w:t>
+            </w:r>
+          </w:p>
+        </w:tc>
+        <w:tc>
+          <w:tcPr>
+            <w:tcW w:type="dxa" w:w="1500"/>
+            <w:tcBorders>
+              <w:top w:val="single" w:color="999999" w:sz="4"/>
+              <w:left w:val="single" w:color="999999" w:sz="4"/>
+              <w:bottom w:val="single" w:color="999999" w:sz="4"/>
+              <w:right w:val="single" w:color="999999" w:sz="4"/>
+            </w:tcBorders>
+            <w:tcMar>
+              <w:top w:type="dxa" w:w="40"/>
+              <w:left w:type="dxa" w:w="80"/>
+              <w:bottom w:type="dxa" w:w="40"/>
+              <w:right w:type="dxa" w:w="80"/>
+            </w:tcMar>
+          </w:tcPr>
+          <w:p>
+            <w:pPr>
+              <w:jc w:val="center"/>
+            </w:pPr>
+            <w:r>
+              <w:rPr>
+                <w:rFonts w:ascii="Times New Roman" w:cs="Times New Roman" w:eastAsia="Times New Roman" w:hAnsi="Times New Roman"/>
+                <w:b w:val="false"/>
+                <w:bCs w:val="false"/>
+                <w:sz w:val="18"/>
+                <w:szCs w:val="18"/>
+              </w:rPr>
+              <w:t xml:space="preserve">0.004</w:t>
+            </w:r>
+          </w:p>
+        </w:tc>
+      </w:tr>
+      <w:tr>
+        <w:tc>
+          <w:tcPr>
+            <w:tcW w:type="dxa" w:w="3226"/>
+            <w:tcBorders>
+              <w:top w:val="single" w:color="999999" w:sz="4"/>
+              <w:left w:val="single" w:color="999999" w:sz="4"/>
+              <w:bottom w:val="single" w:color="999999" w:sz="4"/>
+              <w:right w:val="single" w:color="999999" w:sz="4"/>
+            </w:tcBorders>
+            <w:tcMar>
+              <w:top w:type="dxa" w:w="40"/>
+              <w:left w:type="dxa" w:w="80"/>
+              <w:bottom w:type="dxa" w:w="40"/>
+              <w:right w:type="dxa" w:w="80"/>
+            </w:tcMar>
+          </w:tcPr>
+          <w:p>
+            <w:pPr>
+              <w:jc w:val="left"/>
+            </w:pPr>
+            <w:r>
+              <w:rPr>
+                <w:rFonts w:ascii="Times New Roman" w:cs="Times New Roman" w:eastAsia="Times New Roman" w:hAnsi="Times New Roman"/>
+                <w:b w:val="false"/>
+                <w:bCs w:val="false"/>
+                <w:sz w:val="18"/>
+                <w:szCs w:val="18"/>
+              </w:rPr>
+              <w:t xml:space="preserve">SLUE-SQA-5 test</w:t>
+            </w:r>
+          </w:p>
+        </w:tc>
+        <w:tc>
+          <w:tcPr>
+            <w:tcW w:type="dxa" w:w="1600"/>
+            <w:tcBorders>
+              <w:top w:val="single" w:color="999999" w:sz="4"/>
+              <w:left w:val="single" w:color="999999" w:sz="4"/>
+              <w:bottom w:val="single" w:color="999999" w:sz="4"/>
+              <w:right w:val="single" w:color="999999" w:sz="4"/>
+            </w:tcBorders>
+            <w:tcMar>
+              <w:top w:type="dxa" w:w="40"/>
+              <w:left w:type="dxa" w:w="80"/>
+              <w:bottom w:type="dxa" w:w="40"/>
+              <w:right w:type="dxa" w:w="80"/>
+            </w:tcMar>
+          </w:tcPr>
+          <w:p>
+            <w:pPr>
+              <w:jc w:val="center"/>
+            </w:pPr>
+            <w:r>
+              <w:rPr>
+                <w:rFonts w:ascii="Times New Roman" w:cs="Times New Roman" w:eastAsia="Times New Roman" w:hAnsi="Times New Roman"/>
+                <w:b w:val="false"/>
+                <w:bCs w:val="false"/>
+                <w:sz w:val="18"/>
+                <w:szCs w:val="18"/>
+              </w:rPr>
+              <w:t xml:space="preserve">0.469</w:t>
+            </w:r>
+          </w:p>
+        </w:tc>
+        <w:tc>
+          <w:tcPr>
+            <w:tcW w:type="dxa" w:w="1600"/>
+            <w:tcBorders>
+              <w:top w:val="single" w:color="999999" w:sz="4"/>
+              <w:left w:val="single" w:color="999999" w:sz="4"/>
+              <w:bottom w:val="single" w:color="999999" w:sz="4"/>
+              <w:right w:val="single" w:color="999999" w:sz="4"/>
+            </w:tcBorders>
+            <w:tcMar>
+              <w:top w:type="dxa" w:w="40"/>
+              <w:left w:type="dxa" w:w="80"/>
+              <w:bottom w:type="dxa" w:w="40"/>
+              <w:right w:type="dxa" w:w="80"/>
+            </w:tcMar>
+          </w:tcPr>
+          <w:p>
+            <w:pPr>
+              <w:jc w:val="center"/>
+            </w:pPr>
+            <w:r>
+              <w:rPr>
+                <w:rFonts w:ascii="Times New Roman" w:cs="Times New Roman" w:eastAsia="Times New Roman" w:hAnsi="Times New Roman"/>
+                <w:b w:val="false"/>
+                <w:bCs w:val="false"/>
+                <w:sz w:val="18"/>
+                <w:szCs w:val="18"/>
+              </w:rPr>
+              <w:t xml:space="preserve">0.475</w:t>
+            </w:r>
+          </w:p>
+        </w:tc>
+        <w:tc>
+          <w:tcPr>
+            <w:tcW w:type="dxa" w:w="1100"/>
+            <w:tcBorders>
+              <w:top w:val="single" w:color="999999" w:sz="4"/>
+              <w:left w:val="single" w:color="999999" w:sz="4"/>
+              <w:bottom w:val="single" w:color="999999" w:sz="4"/>
+              <w:right w:val="single" w:color="999999" w:sz="4"/>
+            </w:tcBorders>
+            <w:tcMar>
+              <w:top w:type="dxa" w:w="40"/>
+              <w:left w:type="dxa" w:w="80"/>
+              <w:bottom w:type="dxa" w:w="40"/>
+              <w:right w:type="dxa" w:w="80"/>
+            </w:tcMar>
+          </w:tcPr>
+          <w:p>
+            <w:pPr>
+              <w:jc w:val="center"/>
+            </w:pPr>
+            <w:r>
+              <w:rPr>
+                <w:rFonts w:ascii="Times New Roman" w:cs="Times New Roman" w:eastAsia="Times New Roman" w:hAnsi="Times New Roman"/>
+                <w:b w:val="false"/>
+                <w:bCs w:val="false"/>
+                <w:sz w:val="18"/>
+                <w:szCs w:val="18"/>
+              </w:rPr>
+              <w:t xml:space="preserve">+0.006</w:t>
+            </w:r>
+          </w:p>
+        </w:tc>
+        <w:tc>
+          <w:tcPr>
+            <w:tcW w:type="dxa" w:w="1500"/>
+            <w:tcBorders>
+              <w:top w:val="single" w:color="999999" w:sz="4"/>
+              <w:left w:val="single" w:color="999999" w:sz="4"/>
+              <w:bottom w:val="single" w:color="999999" w:sz="4"/>
+              <w:right w:val="single" w:color="999999" w:sz="4"/>
+            </w:tcBorders>
+            <w:tcMar>
+              <w:top w:type="dxa" w:w="40"/>
+              <w:left w:type="dxa" w:w="80"/>
+              <w:bottom w:type="dxa" w:w="40"/>
+              <w:right w:type="dxa" w:w="80"/>
+            </w:tcMar>
+          </w:tcPr>
+          <w:p>
+            <w:pPr>
+              <w:jc w:val="center"/>
+            </w:pPr>
+            <w:r>
+              <w:rPr>
+                <w:rFonts w:ascii="Times New Roman" w:cs="Times New Roman" w:eastAsia="Times New Roman" w:hAnsi="Times New Roman"/>
+                <w:b w:val="false"/>
+                <w:bCs w:val="false"/>
+                <w:sz w:val="18"/>
+                <w:szCs w:val="18"/>
+              </w:rPr>
+              <w:t xml:space="preserve">0.004</w:t>
+            </w:r>
+          </w:p>
+        </w:tc>
+      </w:tr>
+    </w:tbl>
+    <w:p>
+      <w:pPr>
+        <w:spacing w:after="120" w:before="0" w:line="276"/>
+        <w:jc w:val="both"/>
+      </w:pPr>
+      <w:r>
+        <w:rPr>
+          <w:rFonts w:ascii="Times New Roman" w:cs="Times New Roman" w:eastAsia="Times New Roman" w:hAnsi="Times New Roman"/>
+          <w:b/>
+          <w:bCs/>
+          <w:sz w:val="22"/>
+          <w:szCs w:val="22"/>
+        </w:rPr>
+        <w:t xml:space="preserve">Stronger ASR (descriptive). </w:t>
+      </w:r>
+      <w:r>
+        <w:rPr>
+          <w:rFonts w:ascii="Times New Roman" w:cs="Times New Roman" w:eastAsia="Times New Roman" w:hAnsi="Times New Roman"/>
+          <w:sz w:val="22"/>
+          <w:szCs w:val="22"/>
+        </w:rPr>
+        <w:t xml:space="preserve">Re-transcribing SD-QA with Whisper large-v3-turbo instead of base.en cuts the word error rate by more than half in every dialect (e.g. India-South 0.190 → 0.075) and recovers most of the loss: BM25 → CE on India-South rises from 0.438 to 0.531, against 0.582 for typed questions. The Indian-English gap narrows from 0.10 to about 0.03 nDCG@10 relative to US speakers.</w:t>
+      </w:r>
+    </w:p>
+    <w:p>
+      <w:pPr>
         <w:keepNext/>
         <w:spacing w:after="120" w:before="240"/>
       </w:pPr>
@@ -13836,7 +17160,7 @@
           <w:sz w:val="22"/>
           <w:szCs w:val="22"/>
         </w:rPr>
-        <w:t xml:space="preserve">One reranker family (MiniLM) is evaluated, and the SD-QA recordings are not telephone audio.</w:t>
+        <w:t xml:space="preserve">Two reranker families (MiniLM, BGE) are fine-tuned; the SD-QA, HeySQuAD and SLUE recordings are not telephone audio.</w:t>
       </w:r>
     </w:p>
     <w:p>
@@ -13855,7 +17179,7 @@
           <w:sz w:val="22"/>
           <w:szCs w:val="22"/>
         </w:rPr>
-        <w:t xml:space="preserve">For the 22.7M MiniLM reranker the gains from consistency distillation are small and not significant after correction; they become significant on the larger bge-reranker-base. The hybrid first-stage comparison on SD-QA is exploratory; its pre-registered replication on new real-speech test sets is still running.</w:t>
+        <w:t xml:space="preserve">Distillation gains on MiniLM are small in absolute terms (+0.006 to +0.008 nDCG@10 with the stronger teacher), although significant on all pre-registered test sets.</w:t>
       </w:r>
     </w:p>
     <w:p>
@@ -13874,7 +17198,7 @@
           <w:sz w:val="22"/>
           <w:szCs w:val="22"/>
         </w:rPr>
-        <w:t xml:space="preserve">The training set is small (1,184 queries), and hard negatives may contain unjudged relevant documents, particularly on NFCorpus.</w:t>
+        <w:t xml:space="preserve">The real-speech training set (1,985 HeySQuAD questions) is small, and its real transcripts are noisier than its synthetic ones, so C3 compares noise levels as well as noise types.</w:t>
       </w:r>
     </w:p>
     <w:p>
@@ -13893,7 +17217,7 @@
           <w:sz w:val="22"/>
           <w:szCs w:val="22"/>
         </w:rPr>
-        <w:t xml:space="preserve">Latency is measured on Kaggle hardware (4-thread x86 CPU, Tesla T4), not on the deployment machine.</w:t>
+        <w:t xml:space="preserve">The training set is small (1,184 queries), and hard negatives may contain unjudged relevant documents, particularly on NFCorpus.</w:t>
       </w:r>
     </w:p>
     <w:p>
@@ -13912,6 +17236,25 @@
           <w:sz w:val="22"/>
           <w:szCs w:val="22"/>
         </w:rPr>
+        <w:t xml:space="preserve">Latency is measured on Kaggle hardware (4-thread x86 CPU, Tesla T4), not on the deployment machine.</w:t>
+      </w:r>
+    </w:p>
+    <w:p>
+      <w:pPr>
+        <w:pStyle w:val="ListParagraph"/>
+        <w:numPr>
+          <w:ilvl w:val="0"/>
+          <w:numId w:val="2"/>
+        </w:numPr>
+        <w:spacing w:after="60" w:line="276"/>
+        <w:jc w:val="both"/>
+      </w:pPr>
+      <w:r>
+        <w:rPr>
+          <w:rFonts w:ascii="Times New Roman" w:cs="Times New Roman" w:eastAsia="Times New Roman" w:hAnsi="Times New Roman"/>
+          <w:sz w:val="22"/>
+          <w:szCs w:val="22"/>
+        </w:rPr>
         <w:t xml:space="preserve">The telephone channel is simulated; real calls add codec artefacts and packet loss.</w:t>
       </w:r>
     </w:p>
@@ -13942,7 +17285,7 @@
           <w:sz w:val="22"/>
           <w:szCs w:val="22"/>
         </w:rPr>
-        <w:t xml:space="preserve">We plan to (1) train on real human speech errors using HeySQuAD [22] and test whether this transfers to Indian-English speech better than synthetic errors; (2) transcribe the SD-QA audio with Whisper so that both parts of the study share one ASR model; (3) strengthen consistency distillation with hybrid candidate lists, a larger teacher and a tuned temperature; (4) record a small set of real Indian-English telephone queries; and (5) measure ASR accuracy on real Indian-accented speech with Svarah [23].</w:t>
+        <w:t xml:space="preserve">We plan to (1) re-rank several ASR hypotheses (an N-best list) instead of one transcript, attacking both content-word errors and first-stage recall failures; (2) train on larger and cleaner real-speech data, filtering transcripts by word error rate, to separate noise type from noise level; (3) distil into larger students; (4) record real Indian-English telephone queries; and (5) deploy the hybrid first stage with a distilled reranker in the voice agent.</w:t>
       </w:r>
     </w:p>
     <w:p>
@@ -13972,7 +17315,7 @@
           <w:sz w:val="22"/>
           <w:szCs w:val="22"/>
         </w:rPr>
-        <w:t xml:space="preserve">A pre-registered replication on a modern reranker confirms that clean fine-tuning makes rerankers fragile to speech and shows that label-free consistency distillation significantly improves on the zero-shot model, while content-word errors and first-stage recall failures explain most of the loss. Spoken queries reduce retrieval effectiveness by 7–25% over wideband audio and 24–58% over the telephone on science, medical and finance collections, and by 11% on real speech in eleven English dialects, with Indian English among the hardest hit at 17%. A cross-encoder reranker does not reduce this relative loss, because it only sees the transcript. Fine-tuning the reranker on clean in-domain text makes it more fragile to speech; training on transcripts with labels repairs part of that loss, and label-free consistency distillation avoids it, matching or slightly exceeding the original model on every test set. The largest gain on real speech, however, comes from re-ranking a hybrid candidate list. For voice agents, robustness work should target the speech channel, the first stage and the training objective together, and re-ranking depth must be chosen against the latency budget of a live conversation.</w:t>
+        <w:t xml:space="preserve">Spoken queries reduce retrieval effectiveness by 7–25% over wideband audio, 24–58% over a telephone channel, and 11–19% on real speech, with Indian English among the hardest hit; a cross-encoder reranker improves absolute effectiveness but does not reduce this relative loss. Misrecognised content words drive the loss, and in more than half of the failures the relevant passage never reaches the reranker. Fine-tuning the reranker on clean text makes it more fragile to speech, on two model families. Label-free consistency distillation avoids this damage and, with a stronger teacher, significantly improves on the zero-shot reranker on every pre-registered test set; training on real rather than synthetic speech errors did not help at our scale. The largest gains come from outside the reranker: a hybrid first stage (confirmed on three new real-speech test sets) and a stronger recogniser. Robustness work for voice agents should therefore target the recogniser, the first stage and the training objective together.</w:t>
       </w:r>
     </w:p>
     <w:p>

</xml_diff>

<commit_message>
Add team and faculty names
Co-Authored-By: Claude Opus 5.5 <noreply@anthropic.com>
</commit_message>
<xml_diff>
--- a/paper/Paper.docx
+++ b/paper/Paper.docx
@@ -29,7 +29,7 @@
           <w:sz w:val="22"/>
           <w:szCs w:val="22"/>
         </w:rPr>
-        <w:t xml:space="preserve">[Student Name 1], [Student Name 2], [Student Name 3], [Student Name 4]</w:t>
+        <w:t xml:space="preserve">Arya Shah, Teerth Shah, Urja Singhi</w:t>
       </w:r>
     </w:p>
     <w:p>
@@ -61,7 +61,7 @@
           <w:sz w:val="20"/>
           <w:szCs w:val="20"/>
         </w:rPr>
-        <w:t xml:space="preserve">Mini project — Deep Learning (702AI0C008) and Natural Language Processing (702AI0C009), AY 2026–27 · Faculty: [Faculty names]</w:t>
+        <w:t xml:space="preserve">Mini project — Deep Learning (702AI0C008) and Natural Language Processing (702AI0C009), AY 2026–27 · Faculty: Prof. Abhay Kolhe (Deep Learning) · Prof. Soni Sweta and Prof. Manisha Tiwari (Natural Language Processing)</w:t>
       </w:r>
     </w:p>
     <w:p>

</xml_diff>